<commit_message>
FRD: replace requirement IDs with named items; support real Portal snapshot for Figure 1
Co-Authored-By: Claude Sonnet 5.5 <noreply@anthropic.com>
Claude-Session: https://claude.ai/code/session_01Bwvht38PECEtuVgZEXPTDw
</commit_message>
<xml_diff>
--- a/BUTEC-HSE-Platform-FRD.docx
+++ b/BUTEC-HSE-Platform-FRD.docx
@@ -1375,9 +1375,9 @@
         </w:tblBorders>
       </w:tblPr>
       <w:tblGrid>
-        <w:gridCol w:w="1250"/>
-        <w:gridCol w:w="5050"/>
-        <w:gridCol w:w="3600"/>
+        <w:gridCol w:w="2000"/>
+        <w:gridCol w:w="4600"/>
+        <w:gridCol w:w="3300"/>
       </w:tblGrid>
       <w:tr>
         <w:trPr>
@@ -1386,7 +1386,7 @@
         </w:trPr>
         <w:tc>
           <w:tcPr>
-            <w:tcW w:type="dxa" w:w="1250"/>
+            <w:tcW w:type="dxa" w:w="2000"/>
             <w:tcBorders>
               <w:top w:val="single" w:color="C9D2DE" w:sz="4"/>
               <w:left w:val="single" w:color="C9D2DE" w:sz="4"/>
@@ -1415,13 +1415,13 @@
                 <w:sz w:val="19"/>
                 <w:szCs w:val="19"/>
               </w:rPr>
-              <w:t xml:space="preserve">ID</w:t>
-            </w:r>
-          </w:p>
-        </w:tc>
-        <w:tc>
-          <w:tcPr>
-            <w:tcW w:type="dxa" w:w="5050"/>
+              <w:t xml:space="preserve">Requirement</w:t>
+            </w:r>
+          </w:p>
+        </w:tc>
+        <w:tc>
+          <w:tcPr>
+            <w:tcW w:type="dxa" w:w="4600"/>
             <w:tcBorders>
               <w:top w:val="single" w:color="C9D2DE" w:sz="4"/>
               <w:left w:val="single" w:color="C9D2DE" w:sz="4"/>
@@ -1456,7 +1456,7 @@
         </w:tc>
         <w:tc>
           <w:tcPr>
-            <w:tcW w:type="dxa" w:w="3600"/>
+            <w:tcW w:type="dxa" w:w="3300"/>
             <w:tcBorders>
               <w:top w:val="single" w:color="C9D2DE" w:sz="4"/>
               <w:left w:val="single" w:color="C9D2DE" w:sz="4"/>
@@ -1537,7 +1537,7 @@
         </w:trPr>
         <w:tc>
           <w:tcPr>
-            <w:tcW w:type="dxa" w:w="1250"/>
+            <w:tcW w:type="dxa" w:w="2000"/>
             <w:tcBorders>
               <w:top w:val="single" w:color="C9D2DE" w:sz="4"/>
               <w:left w:val="single" w:color="C9D2DE" w:sz="4"/>
@@ -1565,13 +1565,13 @@
                 <w:sz w:val="19"/>
                 <w:szCs w:val="19"/>
               </w:rPr>
-              <w:t xml:space="preserve">FR-PLT-01</w:t>
-            </w:r>
-          </w:p>
-        </w:tc>
-        <w:tc>
-          <w:tcPr>
-            <w:tcW w:type="dxa" w:w="5050"/>
+              <w:t xml:space="preserve">Single sign-in</w:t>
+            </w:r>
+          </w:p>
+        </w:tc>
+        <w:tc>
+          <w:tcPr>
+            <w:tcW w:type="dxa" w:w="4600"/>
             <w:tcBorders>
               <w:top w:val="single" w:color="C9D2DE" w:sz="4"/>
               <w:left w:val="single" w:color="C9D2DE" w:sz="4"/>
@@ -1604,7 +1604,7 @@
         </w:tc>
         <w:tc>
           <w:tcPr>
-            <w:tcW w:type="dxa" w:w="3600"/>
+            <w:tcW w:type="dxa" w:w="3300"/>
             <w:tcBorders>
               <w:top w:val="single" w:color="C9D2DE" w:sz="4"/>
               <w:left w:val="single" w:color="C9D2DE" w:sz="4"/>
@@ -1642,7 +1642,7 @@
         </w:trPr>
         <w:tc>
           <w:tcPr>
-            <w:tcW w:type="dxa" w:w="1250"/>
+            <w:tcW w:type="dxa" w:w="2000"/>
             <w:tcBorders>
               <w:top w:val="single" w:color="C9D2DE" w:sz="4"/>
               <w:left w:val="single" w:color="C9D2DE" w:sz="4"/>
@@ -1670,13 +1670,13 @@
                 <w:sz w:val="19"/>
                 <w:szCs w:val="19"/>
               </w:rPr>
-              <w:t xml:space="preserve">FR-PLT-02</w:t>
-            </w:r>
-          </w:p>
-        </w:tc>
-        <w:tc>
-          <w:tcPr>
-            <w:tcW w:type="dxa" w:w="5050"/>
+              <w:t xml:space="preserve">One central register</w:t>
+            </w:r>
+          </w:p>
+        </w:tc>
+        <w:tc>
+          <w:tcPr>
+            <w:tcW w:type="dxa" w:w="4600"/>
             <w:tcBorders>
               <w:top w:val="single" w:color="C9D2DE" w:sz="4"/>
               <w:left w:val="single" w:color="C9D2DE" w:sz="4"/>
@@ -1709,7 +1709,7 @@
         </w:tc>
         <w:tc>
           <w:tcPr>
-            <w:tcW w:type="dxa" w:w="3600"/>
+            <w:tcW w:type="dxa" w:w="3300"/>
             <w:tcBorders>
               <w:top w:val="single" w:color="C9D2DE" w:sz="4"/>
               <w:left w:val="single" w:color="C9D2DE" w:sz="4"/>
@@ -1747,7 +1747,7 @@
         </w:trPr>
         <w:tc>
           <w:tcPr>
-            <w:tcW w:type="dxa" w:w="1250"/>
+            <w:tcW w:type="dxa" w:w="2000"/>
             <w:tcBorders>
               <w:top w:val="single" w:color="C9D2DE" w:sz="4"/>
               <w:left w:val="single" w:color="C9D2DE" w:sz="4"/>
@@ -1775,13 +1775,13 @@
                 <w:sz w:val="19"/>
                 <w:szCs w:val="19"/>
               </w:rPr>
-              <w:t xml:space="preserve">FR-PLT-03</w:t>
-            </w:r>
-          </w:p>
-        </w:tc>
-        <w:tc>
-          <w:tcPr>
-            <w:tcW w:type="dxa" w:w="5050"/>
+              <w:t xml:space="preserve">Access by role and project</w:t>
+            </w:r>
+          </w:p>
+        </w:tc>
+        <w:tc>
+          <w:tcPr>
+            <w:tcW w:type="dxa" w:w="4600"/>
             <w:tcBorders>
               <w:top w:val="single" w:color="C9D2DE" w:sz="4"/>
               <w:left w:val="single" w:color="C9D2DE" w:sz="4"/>
@@ -1814,7 +1814,7 @@
         </w:tc>
         <w:tc>
           <w:tcPr>
-            <w:tcW w:type="dxa" w:w="3600"/>
+            <w:tcW w:type="dxa" w:w="3300"/>
             <w:tcBorders>
               <w:top w:val="single" w:color="C9D2DE" w:sz="4"/>
               <w:left w:val="single" w:color="C9D2DE" w:sz="4"/>
@@ -1852,7 +1852,7 @@
         </w:trPr>
         <w:tc>
           <w:tcPr>
-            <w:tcW w:type="dxa" w:w="1250"/>
+            <w:tcW w:type="dxa" w:w="2000"/>
             <w:tcBorders>
               <w:top w:val="single" w:color="C9D2DE" w:sz="4"/>
               <w:left w:val="single" w:color="C9D2DE" w:sz="4"/>
@@ -1880,13 +1880,13 @@
                 <w:sz w:val="19"/>
                 <w:szCs w:val="19"/>
               </w:rPr>
-              <w:t xml:space="preserve">FR-PLT-04</w:t>
-            </w:r>
-          </w:p>
-        </w:tc>
-        <w:tc>
-          <w:tcPr>
-            <w:tcW w:type="dxa" w:w="5050"/>
+              <w:t xml:space="preserve">Notifications and announcements</w:t>
+            </w:r>
+          </w:p>
+        </w:tc>
+        <w:tc>
+          <w:tcPr>
+            <w:tcW w:type="dxa" w:w="4600"/>
             <w:tcBorders>
               <w:top w:val="single" w:color="C9D2DE" w:sz="4"/>
               <w:left w:val="single" w:color="C9D2DE" w:sz="4"/>
@@ -1919,7 +1919,7 @@
         </w:tc>
         <w:tc>
           <w:tcPr>
-            <w:tcW w:type="dxa" w:w="3600"/>
+            <w:tcW w:type="dxa" w:w="3300"/>
             <w:tcBorders>
               <w:top w:val="single" w:color="C9D2DE" w:sz="4"/>
               <w:left w:val="single" w:color="C9D2DE" w:sz="4"/>
@@ -1957,7 +1957,7 @@
         </w:trPr>
         <w:tc>
           <w:tcPr>
-            <w:tcW w:type="dxa" w:w="1250"/>
+            <w:tcW w:type="dxa" w:w="2000"/>
             <w:tcBorders>
               <w:top w:val="single" w:color="C9D2DE" w:sz="4"/>
               <w:left w:val="single" w:color="C9D2DE" w:sz="4"/>
@@ -1985,13 +1985,13 @@
                 <w:sz w:val="19"/>
                 <w:szCs w:val="19"/>
               </w:rPr>
-              <w:t xml:space="preserve">FR-PLT-05</w:t>
-            </w:r>
-          </w:p>
-        </w:tc>
-        <w:tc>
-          <w:tcPr>
-            <w:tcW w:type="dxa" w:w="5050"/>
+              <w:t xml:space="preserve">Search and common look</w:t>
+            </w:r>
+          </w:p>
+        </w:tc>
+        <w:tc>
+          <w:tcPr>
+            <w:tcW w:type="dxa" w:w="4600"/>
             <w:tcBorders>
               <w:top w:val="single" w:color="C9D2DE" w:sz="4"/>
               <w:left w:val="single" w:color="C9D2DE" w:sz="4"/>
@@ -2024,7 +2024,7 @@
         </w:tc>
         <w:tc>
           <w:tcPr>
-            <w:tcW w:type="dxa" w:w="3600"/>
+            <w:tcW w:type="dxa" w:w="3300"/>
             <w:tcBorders>
               <w:top w:val="single" w:color="C9D2DE" w:sz="4"/>
               <w:left w:val="single" w:color="C9D2DE" w:sz="4"/>
@@ -2103,7 +2103,7 @@
         </w:trPr>
         <w:tc>
           <w:tcPr>
-            <w:tcW w:type="dxa" w:w="1250"/>
+            <w:tcW w:type="dxa" w:w="2000"/>
             <w:tcBorders>
               <w:top w:val="single" w:color="C9D2DE" w:sz="4"/>
               <w:left w:val="single" w:color="C9D2DE" w:sz="4"/>
@@ -2131,13 +2131,13 @@
                 <w:sz w:val="19"/>
                 <w:szCs w:val="19"/>
               </w:rPr>
-              <w:t xml:space="preserve">FR-PLT-06</w:t>
-            </w:r>
-          </w:p>
-        </w:tc>
-        <w:tc>
-          <w:tcPr>
-            <w:tcW w:type="dxa" w:w="5050"/>
+              <w:t xml:space="preserve">Automatic assignment</w:t>
+            </w:r>
+          </w:p>
+        </w:tc>
+        <w:tc>
+          <w:tcPr>
+            <w:tcW w:type="dxa" w:w="4600"/>
             <w:tcBorders>
               <w:top w:val="single" w:color="C9D2DE" w:sz="4"/>
               <w:left w:val="single" w:color="C9D2DE" w:sz="4"/>
@@ -2170,7 +2170,7 @@
         </w:tc>
         <w:tc>
           <w:tcPr>
-            <w:tcW w:type="dxa" w:w="3600"/>
+            <w:tcW w:type="dxa" w:w="3300"/>
             <w:tcBorders>
               <w:top w:val="single" w:color="C9D2DE" w:sz="4"/>
               <w:left w:val="single" w:color="C9D2DE" w:sz="4"/>
@@ -2208,7 +2208,7 @@
         </w:trPr>
         <w:tc>
           <w:tcPr>
-            <w:tcW w:type="dxa" w:w="1250"/>
+            <w:tcW w:type="dxa" w:w="2000"/>
             <w:tcBorders>
               <w:top w:val="single" w:color="C9D2DE" w:sz="4"/>
               <w:left w:val="single" w:color="C9D2DE" w:sz="4"/>
@@ -2236,13 +2236,13 @@
                 <w:sz w:val="19"/>
                 <w:szCs w:val="19"/>
               </w:rPr>
-              <w:t xml:space="preserve">FR-PLT-07</w:t>
-            </w:r>
-          </w:p>
-        </w:tc>
-        <w:tc>
-          <w:tcPr>
-            <w:tcW w:type="dxa" w:w="5050"/>
+              <w:t xml:space="preserve">Deadlines and reminders</w:t>
+            </w:r>
+          </w:p>
+        </w:tc>
+        <w:tc>
+          <w:tcPr>
+            <w:tcW w:type="dxa" w:w="4600"/>
             <w:tcBorders>
               <w:top w:val="single" w:color="C9D2DE" w:sz="4"/>
               <w:left w:val="single" w:color="C9D2DE" w:sz="4"/>
@@ -2275,7 +2275,7 @@
         </w:tc>
         <w:tc>
           <w:tcPr>
-            <w:tcW w:type="dxa" w:w="3600"/>
+            <w:tcW w:type="dxa" w:w="3300"/>
             <w:tcBorders>
               <w:top w:val="single" w:color="C9D2DE" w:sz="4"/>
               <w:left w:val="single" w:color="C9D2DE" w:sz="4"/>
@@ -2313,7 +2313,7 @@
         </w:trPr>
         <w:tc>
           <w:tcPr>
-            <w:tcW w:type="dxa" w:w="1250"/>
+            <w:tcW w:type="dxa" w:w="2000"/>
             <w:tcBorders>
               <w:top w:val="single" w:color="C9D2DE" w:sz="4"/>
               <w:left w:val="single" w:color="C9D2DE" w:sz="4"/>
@@ -2341,13 +2341,13 @@
                 <w:sz w:val="19"/>
                 <w:szCs w:val="19"/>
               </w:rPr>
-              <w:t xml:space="preserve">FR-PLT-08</w:t>
-            </w:r>
-          </w:p>
-        </w:tc>
-        <w:tc>
-          <w:tcPr>
-            <w:tcW w:type="dxa" w:w="5050"/>
+              <w:t xml:space="preserve">Automatic calculation</w:t>
+            </w:r>
+          </w:p>
+        </w:tc>
+        <w:tc>
+          <w:tcPr>
+            <w:tcW w:type="dxa" w:w="4600"/>
             <w:tcBorders>
               <w:top w:val="single" w:color="C9D2DE" w:sz="4"/>
               <w:left w:val="single" w:color="C9D2DE" w:sz="4"/>
@@ -2380,7 +2380,7 @@
         </w:tc>
         <w:tc>
           <w:tcPr>
-            <w:tcW w:type="dxa" w:w="3600"/>
+            <w:tcW w:type="dxa" w:w="3300"/>
             <w:tcBorders>
               <w:top w:val="single" w:color="C9D2DE" w:sz="4"/>
               <w:left w:val="single" w:color="C9D2DE" w:sz="4"/>
@@ -2418,7 +2418,7 @@
         </w:trPr>
         <w:tc>
           <w:tcPr>
-            <w:tcW w:type="dxa" w:w="1250"/>
+            <w:tcW w:type="dxa" w:w="2000"/>
             <w:tcBorders>
               <w:top w:val="single" w:color="C9D2DE" w:sz="4"/>
               <w:left w:val="single" w:color="C9D2DE" w:sz="4"/>
@@ -2446,13 +2446,13 @@
                 <w:sz w:val="19"/>
                 <w:szCs w:val="19"/>
               </w:rPr>
-              <w:t xml:space="preserve">FR-PLT-09</w:t>
-            </w:r>
-          </w:p>
-        </w:tc>
-        <w:tc>
-          <w:tcPr>
-            <w:tcW w:type="dxa" w:w="5050"/>
+              <w:t xml:space="preserve">Automatic outputs</w:t>
+            </w:r>
+          </w:p>
+        </w:tc>
+        <w:tc>
+          <w:tcPr>
+            <w:tcW w:type="dxa" w:w="4600"/>
             <w:tcBorders>
               <w:top w:val="single" w:color="C9D2DE" w:sz="4"/>
               <w:left w:val="single" w:color="C9D2DE" w:sz="4"/>
@@ -2485,7 +2485,7 @@
         </w:tc>
         <w:tc>
           <w:tcPr>
-            <w:tcW w:type="dxa" w:w="3600"/>
+            <w:tcW w:type="dxa" w:w="3300"/>
             <w:tcBorders>
               <w:top w:val="single" w:color="C9D2DE" w:sz="4"/>
               <w:left w:val="single" w:color="C9D2DE" w:sz="4"/>
@@ -2564,7 +2564,7 @@
         </w:trPr>
         <w:tc>
           <w:tcPr>
-            <w:tcW w:type="dxa" w:w="1250"/>
+            <w:tcW w:type="dxa" w:w="2000"/>
             <w:tcBorders>
               <w:top w:val="single" w:color="C9D2DE" w:sz="4"/>
               <w:left w:val="single" w:color="C9D2DE" w:sz="4"/>
@@ -2592,13 +2592,13 @@
                 <w:sz w:val="19"/>
                 <w:szCs w:val="19"/>
               </w:rPr>
-              <w:t xml:space="preserve">FR-PLT-10</w:t>
-            </w:r>
-          </w:p>
-        </w:tc>
-        <w:tc>
-          <w:tcPr>
-            <w:tcW w:type="dxa" w:w="5050"/>
+              <w:t xml:space="preserve">No deletion</w:t>
+            </w:r>
+          </w:p>
+        </w:tc>
+        <w:tc>
+          <w:tcPr>
+            <w:tcW w:type="dxa" w:w="4600"/>
             <w:tcBorders>
               <w:top w:val="single" w:color="C9D2DE" w:sz="4"/>
               <w:left w:val="single" w:color="C9D2DE" w:sz="4"/>
@@ -2631,7 +2631,7 @@
         </w:tc>
         <w:tc>
           <w:tcPr>
-            <w:tcW w:type="dxa" w:w="3600"/>
+            <w:tcW w:type="dxa" w:w="3300"/>
             <w:tcBorders>
               <w:top w:val="single" w:color="C9D2DE" w:sz="4"/>
               <w:left w:val="single" w:color="C9D2DE" w:sz="4"/>
@@ -2669,7 +2669,7 @@
         </w:trPr>
         <w:tc>
           <w:tcPr>
-            <w:tcW w:type="dxa" w:w="1250"/>
+            <w:tcW w:type="dxa" w:w="2000"/>
             <w:tcBorders>
               <w:top w:val="single" w:color="C9D2DE" w:sz="4"/>
               <w:left w:val="single" w:color="C9D2DE" w:sz="4"/>
@@ -2697,13 +2697,13 @@
                 <w:sz w:val="19"/>
                 <w:szCs w:val="19"/>
               </w:rPr>
-              <w:t xml:space="preserve">FR-PLT-11</w:t>
-            </w:r>
-          </w:p>
-        </w:tc>
-        <w:tc>
-          <w:tcPr>
-            <w:tcW w:type="dxa" w:w="5050"/>
+              <w:t xml:space="preserve">Fixed versions</w:t>
+            </w:r>
+          </w:p>
+        </w:tc>
+        <w:tc>
+          <w:tcPr>
+            <w:tcW w:type="dxa" w:w="4600"/>
             <w:tcBorders>
               <w:top w:val="single" w:color="C9D2DE" w:sz="4"/>
               <w:left w:val="single" w:color="C9D2DE" w:sz="4"/>
@@ -2736,7 +2736,7 @@
         </w:tc>
         <w:tc>
           <w:tcPr>
-            <w:tcW w:type="dxa" w:w="3600"/>
+            <w:tcW w:type="dxa" w:w="3300"/>
             <w:tcBorders>
               <w:top w:val="single" w:color="C9D2DE" w:sz="4"/>
               <w:left w:val="single" w:color="C9D2DE" w:sz="4"/>
@@ -2774,7 +2774,7 @@
         </w:trPr>
         <w:tc>
           <w:tcPr>
-            <w:tcW w:type="dxa" w:w="1250"/>
+            <w:tcW w:type="dxa" w:w="2000"/>
             <w:tcBorders>
               <w:top w:val="single" w:color="C9D2DE" w:sz="4"/>
               <w:left w:val="single" w:color="C9D2DE" w:sz="4"/>
@@ -2802,13 +2802,13 @@
                 <w:sz w:val="19"/>
                 <w:szCs w:val="19"/>
               </w:rPr>
-              <w:t xml:space="preserve">FR-PLT-12</w:t>
-            </w:r>
-          </w:p>
-        </w:tc>
-        <w:tc>
-          <w:tcPr>
-            <w:tcW w:type="dxa" w:w="5050"/>
+              <w:t xml:space="preserve">Audit trail</w:t>
+            </w:r>
+          </w:p>
+        </w:tc>
+        <w:tc>
+          <w:tcPr>
+            <w:tcW w:type="dxa" w:w="4600"/>
             <w:tcBorders>
               <w:top w:val="single" w:color="C9D2DE" w:sz="4"/>
               <w:left w:val="single" w:color="C9D2DE" w:sz="4"/>
@@ -2841,7 +2841,7 @@
         </w:tc>
         <w:tc>
           <w:tcPr>
-            <w:tcW w:type="dxa" w:w="3600"/>
+            <w:tcW w:type="dxa" w:w="3300"/>
             <w:tcBorders>
               <w:top w:val="single" w:color="C9D2DE" w:sz="4"/>
               <w:left w:val="single" w:color="C9D2DE" w:sz="4"/>
@@ -2879,7 +2879,7 @@
         </w:trPr>
         <w:tc>
           <w:tcPr>
-            <w:tcW w:type="dxa" w:w="1250"/>
+            <w:tcW w:type="dxa" w:w="2000"/>
             <w:tcBorders>
               <w:top w:val="single" w:color="C9D2DE" w:sz="4"/>
               <w:left w:val="single" w:color="C9D2DE" w:sz="4"/>
@@ -2907,13 +2907,13 @@
                 <w:sz w:val="19"/>
                 <w:szCs w:val="19"/>
               </w:rPr>
-              <w:t xml:space="preserve">FR-PLT-13</w:t>
-            </w:r>
-          </w:p>
-        </w:tc>
-        <w:tc>
-          <w:tcPr>
-            <w:tcW w:type="dxa" w:w="5050"/>
+              <w:t xml:space="preserve">Long-term retention</w:t>
+            </w:r>
+          </w:p>
+        </w:tc>
+        <w:tc>
+          <w:tcPr>
+            <w:tcW w:type="dxa" w:w="4600"/>
             <w:tcBorders>
               <w:top w:val="single" w:color="C9D2DE" w:sz="4"/>
               <w:left w:val="single" w:color="C9D2DE" w:sz="4"/>
@@ -2946,7 +2946,7 @@
         </w:tc>
         <w:tc>
           <w:tcPr>
-            <w:tcW w:type="dxa" w:w="3600"/>
+            <w:tcW w:type="dxa" w:w="3300"/>
             <w:tcBorders>
               <w:top w:val="single" w:color="C9D2DE" w:sz="4"/>
               <w:left w:val="single" w:color="C9D2DE" w:sz="4"/>
@@ -2984,7 +2984,7 @@
         </w:trPr>
         <w:tc>
           <w:tcPr>
-            <w:tcW w:type="dxa" w:w="1250"/>
+            <w:tcW w:type="dxa" w:w="2000"/>
             <w:tcBorders>
               <w:top w:val="single" w:color="C9D2DE" w:sz="4"/>
               <w:left w:val="single" w:color="C9D2DE" w:sz="4"/>
@@ -3012,13 +3012,13 @@
                 <w:sz w:val="19"/>
                 <w:szCs w:val="19"/>
               </w:rPr>
-              <w:t xml:space="preserve">FR-PLT-14</w:t>
-            </w:r>
-          </w:p>
-        </w:tc>
-        <w:tc>
-          <w:tcPr>
-            <w:tcW w:type="dxa" w:w="5050"/>
+              <w:t xml:space="preserve">Automatic backups</w:t>
+            </w:r>
+          </w:p>
+        </w:tc>
+        <w:tc>
+          <w:tcPr>
+            <w:tcW w:type="dxa" w:w="4600"/>
             <w:tcBorders>
               <w:top w:val="single" w:color="C9D2DE" w:sz="4"/>
               <w:left w:val="single" w:color="C9D2DE" w:sz="4"/>
@@ -3051,7 +3051,7 @@
         </w:tc>
         <w:tc>
           <w:tcPr>
-            <w:tcW w:type="dxa" w:w="3600"/>
+            <w:tcW w:type="dxa" w:w="3300"/>
             <w:tcBorders>
               <w:top w:val="single" w:color="C9D2DE" w:sz="4"/>
               <w:left w:val="single" w:color="C9D2DE" w:sz="4"/>
@@ -3089,7 +3089,7 @@
         </w:trPr>
         <w:tc>
           <w:tcPr>
-            <w:tcW w:type="dxa" w:w="1250"/>
+            <w:tcW w:type="dxa" w:w="2000"/>
             <w:tcBorders>
               <w:top w:val="single" w:color="C9D2DE" w:sz="4"/>
               <w:left w:val="single" w:color="C9D2DE" w:sz="4"/>
@@ -3117,13 +3117,13 @@
                 <w:sz w:val="19"/>
                 <w:szCs w:val="19"/>
               </w:rPr>
-              <w:t xml:space="preserve">FR-PLT-15</w:t>
-            </w:r>
-          </w:p>
-        </w:tc>
-        <w:tc>
-          <w:tcPr>
-            <w:tcW w:type="dxa" w:w="5050"/>
+              <w:t xml:space="preserve">History import</w:t>
+            </w:r>
+          </w:p>
+        </w:tc>
+        <w:tc>
+          <w:tcPr>
+            <w:tcW w:type="dxa" w:w="4600"/>
             <w:tcBorders>
               <w:top w:val="single" w:color="C9D2DE" w:sz="4"/>
               <w:left w:val="single" w:color="C9D2DE" w:sz="4"/>
@@ -3156,7 +3156,7 @@
         </w:tc>
         <w:tc>
           <w:tcPr>
-            <w:tcW w:type="dxa" w:w="3600"/>
+            <w:tcW w:type="dxa" w:w="3300"/>
             <w:tcBorders>
               <w:top w:val="single" w:color="C9D2DE" w:sz="4"/>
               <w:left w:val="single" w:color="C9D2DE" w:sz="4"/>
@@ -3419,9 +3419,9 @@
         </w:tblBorders>
       </w:tblPr>
       <w:tblGrid>
-        <w:gridCol w:w="1250"/>
-        <w:gridCol w:w="5050"/>
-        <w:gridCol w:w="3600"/>
+        <w:gridCol w:w="2000"/>
+        <w:gridCol w:w="4600"/>
+        <w:gridCol w:w="3300"/>
       </w:tblGrid>
       <w:tr>
         <w:trPr>
@@ -3430,7 +3430,7 @@
         </w:trPr>
         <w:tc>
           <w:tcPr>
-            <w:tcW w:type="dxa" w:w="1250"/>
+            <w:tcW w:type="dxa" w:w="2000"/>
             <w:tcBorders>
               <w:top w:val="single" w:color="C9D2DE" w:sz="4"/>
               <w:left w:val="single" w:color="C9D2DE" w:sz="4"/>
@@ -3459,13 +3459,13 @@
                 <w:sz w:val="19"/>
                 <w:szCs w:val="19"/>
               </w:rPr>
-              <w:t xml:space="preserve">ID</w:t>
-            </w:r>
-          </w:p>
-        </w:tc>
-        <w:tc>
-          <w:tcPr>
-            <w:tcW w:type="dxa" w:w="5050"/>
+              <w:t xml:space="preserve">Requirement</w:t>
+            </w:r>
+          </w:p>
+        </w:tc>
+        <w:tc>
+          <w:tcPr>
+            <w:tcW w:type="dxa" w:w="4600"/>
             <w:tcBorders>
               <w:top w:val="single" w:color="C9D2DE" w:sz="4"/>
               <w:left w:val="single" w:color="C9D2DE" w:sz="4"/>
@@ -3500,7 +3500,7 @@
         </w:tc>
         <w:tc>
           <w:tcPr>
-            <w:tcW w:type="dxa" w:w="3600"/>
+            <w:tcW w:type="dxa" w:w="3300"/>
             <w:tcBorders>
               <w:top w:val="single" w:color="C9D2DE" w:sz="4"/>
               <w:left w:val="single" w:color="C9D2DE" w:sz="4"/>
@@ -3540,7 +3540,7 @@
         </w:trPr>
         <w:tc>
           <w:tcPr>
-            <w:tcW w:type="dxa" w:w="1250"/>
+            <w:tcW w:type="dxa" w:w="2000"/>
             <w:tcBorders>
               <w:top w:val="single" w:color="C9D2DE" w:sz="4"/>
               <w:left w:val="single" w:color="C9D2DE" w:sz="4"/>
@@ -3568,13 +3568,13 @@
                 <w:sz w:val="19"/>
                 <w:szCs w:val="19"/>
               </w:rPr>
-              <w:t xml:space="preserve">FR-POR-01</w:t>
-            </w:r>
-          </w:p>
-        </w:tc>
-        <w:tc>
-          <w:tcPr>
-            <w:tcW w:type="dxa" w:w="5050"/>
+              <w:t xml:space="preserve">Project register</w:t>
+            </w:r>
+          </w:p>
+        </w:tc>
+        <w:tc>
+          <w:tcPr>
+            <w:tcW w:type="dxa" w:w="4600"/>
             <w:tcBorders>
               <w:top w:val="single" w:color="C9D2DE" w:sz="4"/>
               <w:left w:val="single" w:color="C9D2DE" w:sz="4"/>
@@ -3607,7 +3607,7 @@
         </w:tc>
         <w:tc>
           <w:tcPr>
-            <w:tcW w:type="dxa" w:w="3600"/>
+            <w:tcW w:type="dxa" w:w="3300"/>
             <w:tcBorders>
               <w:top w:val="single" w:color="C9D2DE" w:sz="4"/>
               <w:left w:val="single" w:color="C9D2DE" w:sz="4"/>
@@ -3645,7 +3645,7 @@
         </w:trPr>
         <w:tc>
           <w:tcPr>
-            <w:tcW w:type="dxa" w:w="1250"/>
+            <w:tcW w:type="dxa" w:w="2000"/>
             <w:tcBorders>
               <w:top w:val="single" w:color="C9D2DE" w:sz="4"/>
               <w:left w:val="single" w:color="C9D2DE" w:sz="4"/>
@@ -3673,13 +3673,13 @@
                 <w:sz w:val="19"/>
                 <w:szCs w:val="19"/>
               </w:rPr>
-              <w:t xml:space="preserve">FR-POR-02</w:t>
-            </w:r>
-          </w:p>
-        </w:tc>
-        <w:tc>
-          <w:tcPr>
-            <w:tcW w:type="dxa" w:w="5050"/>
+              <w:t xml:space="preserve">User directory</w:t>
+            </w:r>
+          </w:p>
+        </w:tc>
+        <w:tc>
+          <w:tcPr>
+            <w:tcW w:type="dxa" w:w="4600"/>
             <w:tcBorders>
               <w:top w:val="single" w:color="C9D2DE" w:sz="4"/>
               <w:left w:val="single" w:color="C9D2DE" w:sz="4"/>
@@ -3712,7 +3712,7 @@
         </w:tc>
         <w:tc>
           <w:tcPr>
-            <w:tcW w:type="dxa" w:w="3600"/>
+            <w:tcW w:type="dxa" w:w="3300"/>
             <w:tcBorders>
               <w:top w:val="single" w:color="C9D2DE" w:sz="4"/>
               <w:left w:val="single" w:color="C9D2DE" w:sz="4"/>
@@ -3750,7 +3750,7 @@
         </w:trPr>
         <w:tc>
           <w:tcPr>
-            <w:tcW w:type="dxa" w:w="1250"/>
+            <w:tcW w:type="dxa" w:w="2000"/>
             <w:tcBorders>
               <w:top w:val="single" w:color="C9D2DE" w:sz="4"/>
               <w:left w:val="single" w:color="C9D2DE" w:sz="4"/>
@@ -3778,13 +3778,13 @@
                 <w:sz w:val="19"/>
                 <w:szCs w:val="19"/>
               </w:rPr>
-              <w:t xml:space="preserve">FR-POR-03</w:t>
-            </w:r>
-          </w:p>
-        </w:tc>
-        <w:tc>
-          <w:tcPr>
-            <w:tcW w:type="dxa" w:w="5050"/>
+              <w:t xml:space="preserve">Application cards</w:t>
+            </w:r>
+          </w:p>
+        </w:tc>
+        <w:tc>
+          <w:tcPr>
+            <w:tcW w:type="dxa" w:w="4600"/>
             <w:tcBorders>
               <w:top w:val="single" w:color="C9D2DE" w:sz="4"/>
               <w:left w:val="single" w:color="C9D2DE" w:sz="4"/>
@@ -3817,7 +3817,7 @@
         </w:tc>
         <w:tc>
           <w:tcPr>
-            <w:tcW w:type="dxa" w:w="3600"/>
+            <w:tcW w:type="dxa" w:w="3300"/>
             <w:tcBorders>
               <w:top w:val="single" w:color="C9D2DE" w:sz="4"/>
               <w:left w:val="single" w:color="C9D2DE" w:sz="4"/>
@@ -3855,7 +3855,7 @@
         </w:trPr>
         <w:tc>
           <w:tcPr>
-            <w:tcW w:type="dxa" w:w="1250"/>
+            <w:tcW w:type="dxa" w:w="2000"/>
             <w:tcBorders>
               <w:top w:val="single" w:color="C9D2DE" w:sz="4"/>
               <w:left w:val="single" w:color="C9D2DE" w:sz="4"/>
@@ -3883,13 +3883,13 @@
                 <w:sz w:val="19"/>
                 <w:szCs w:val="19"/>
               </w:rPr>
-              <w:t xml:space="preserve">FR-POR-04</w:t>
-            </w:r>
-          </w:p>
-        </w:tc>
-        <w:tc>
-          <w:tcPr>
-            <w:tcW w:type="dxa" w:w="5050"/>
+              <w:t xml:space="preserve">Announcements and search</w:t>
+            </w:r>
+          </w:p>
+        </w:tc>
+        <w:tc>
+          <w:tcPr>
+            <w:tcW w:type="dxa" w:w="4600"/>
             <w:tcBorders>
               <w:top w:val="single" w:color="C9D2DE" w:sz="4"/>
               <w:left w:val="single" w:color="C9D2DE" w:sz="4"/>
@@ -3922,7 +3922,7 @@
         </w:tc>
         <w:tc>
           <w:tcPr>
-            <w:tcW w:type="dxa" w:w="3600"/>
+            <w:tcW w:type="dxa" w:w="3300"/>
             <w:tcBorders>
               <w:top w:val="single" w:color="C9D2DE" w:sz="4"/>
               <w:left w:val="single" w:color="C9D2DE" w:sz="4"/>
@@ -3960,7 +3960,7 @@
         </w:trPr>
         <w:tc>
           <w:tcPr>
-            <w:tcW w:type="dxa" w:w="1250"/>
+            <w:tcW w:type="dxa" w:w="2000"/>
             <w:tcBorders>
               <w:top w:val="single" w:color="C9D2DE" w:sz="4"/>
               <w:left w:val="single" w:color="C9D2DE" w:sz="4"/>
@@ -3988,13 +3988,13 @@
                 <w:sz w:val="19"/>
                 <w:szCs w:val="19"/>
               </w:rPr>
-              <w:t xml:space="preserve">FR-POR-05</w:t>
-            </w:r>
-          </w:p>
-        </w:tc>
-        <w:tc>
-          <w:tcPr>
-            <w:tcW w:type="dxa" w:w="5050"/>
+              <w:t xml:space="preserve">Controlled matrices</w:t>
+            </w:r>
+          </w:p>
+        </w:tc>
+        <w:tc>
+          <w:tcPr>
+            <w:tcW w:type="dxa" w:w="4600"/>
             <w:tcBorders>
               <w:top w:val="single" w:color="C9D2DE" w:sz="4"/>
               <w:left w:val="single" w:color="C9D2DE" w:sz="4"/>
@@ -4027,7 +4027,7 @@
         </w:tc>
         <w:tc>
           <w:tcPr>
-            <w:tcW w:type="dxa" w:w="3600"/>
+            <w:tcW w:type="dxa" w:w="3300"/>
             <w:tcBorders>
               <w:top w:val="single" w:color="C9D2DE" w:sz="4"/>
               <w:left w:val="single" w:color="C9D2DE" w:sz="4"/>
@@ -4065,7 +4065,7 @@
         </w:trPr>
         <w:tc>
           <w:tcPr>
-            <w:tcW w:type="dxa" w:w="1250"/>
+            <w:tcW w:type="dxa" w:w="2000"/>
             <w:tcBorders>
               <w:top w:val="single" w:color="C9D2DE" w:sz="4"/>
               <w:left w:val="single" w:color="C9D2DE" w:sz="4"/>
@@ -4093,13 +4093,13 @@
                 <w:sz w:val="19"/>
                 <w:szCs w:val="19"/>
               </w:rPr>
-              <w:t xml:space="preserve">FR-POR-06</w:t>
-            </w:r>
-          </w:p>
-        </w:tc>
-        <w:tc>
-          <w:tcPr>
-            <w:tcW w:type="dxa" w:w="5050"/>
+              <w:t xml:space="preserve">Health and backups</w:t>
+            </w:r>
+          </w:p>
+        </w:tc>
+        <w:tc>
+          <w:tcPr>
+            <w:tcW w:type="dxa" w:w="4600"/>
             <w:tcBorders>
               <w:top w:val="single" w:color="C9D2DE" w:sz="4"/>
               <w:left w:val="single" w:color="C9D2DE" w:sz="4"/>
@@ -4132,7 +4132,7 @@
         </w:tc>
         <w:tc>
           <w:tcPr>
-            <w:tcW w:type="dxa" w:w="3600"/>
+            <w:tcW w:type="dxa" w:w="3300"/>
             <w:tcBorders>
               <w:top w:val="single" w:color="C9D2DE" w:sz="4"/>
               <w:left w:val="single" w:color="C9D2DE" w:sz="4"/>
@@ -4308,9 +4308,9 @@
         </w:tblBorders>
       </w:tblPr>
       <w:tblGrid>
-        <w:gridCol w:w="1250"/>
-        <w:gridCol w:w="5050"/>
-        <w:gridCol w:w="3600"/>
+        <w:gridCol w:w="2000"/>
+        <w:gridCol w:w="4600"/>
+        <w:gridCol w:w="3300"/>
       </w:tblGrid>
       <w:tr>
         <w:trPr>
@@ -4319,7 +4319,7 @@
         </w:trPr>
         <w:tc>
           <w:tcPr>
-            <w:tcW w:type="dxa" w:w="1250"/>
+            <w:tcW w:type="dxa" w:w="2000"/>
             <w:tcBorders>
               <w:top w:val="single" w:color="C9D2DE" w:sz="4"/>
               <w:left w:val="single" w:color="C9D2DE" w:sz="4"/>
@@ -4348,13 +4348,13 @@
                 <w:sz w:val="19"/>
                 <w:szCs w:val="19"/>
               </w:rPr>
-              <w:t xml:space="preserve">ID</w:t>
-            </w:r>
-          </w:p>
-        </w:tc>
-        <w:tc>
-          <w:tcPr>
-            <w:tcW w:type="dxa" w:w="5050"/>
+              <w:t xml:space="preserve">Requirement</w:t>
+            </w:r>
+          </w:p>
+        </w:tc>
+        <w:tc>
+          <w:tcPr>
+            <w:tcW w:type="dxa" w:w="4600"/>
             <w:tcBorders>
               <w:top w:val="single" w:color="C9D2DE" w:sz="4"/>
               <w:left w:val="single" w:color="C9D2DE" w:sz="4"/>
@@ -4389,7 +4389,7 @@
         </w:tc>
         <w:tc>
           <w:tcPr>
-            <w:tcW w:type="dxa" w:w="3600"/>
+            <w:tcW w:type="dxa" w:w="3300"/>
             <w:tcBorders>
               <w:top w:val="single" w:color="C9D2DE" w:sz="4"/>
               <w:left w:val="single" w:color="C9D2DE" w:sz="4"/>
@@ -4429,7 +4429,7 @@
         </w:trPr>
         <w:tc>
           <w:tcPr>
-            <w:tcW w:type="dxa" w:w="1250"/>
+            <w:tcW w:type="dxa" w:w="2000"/>
             <w:tcBorders>
               <w:top w:val="single" w:color="C9D2DE" w:sz="4"/>
               <w:left w:val="single" w:color="C9D2DE" w:sz="4"/>
@@ -4457,13 +4457,13 @@
                 <w:sz w:val="19"/>
                 <w:szCs w:val="19"/>
               </w:rPr>
-              <w:t xml:space="preserve">FR-STA-01</w:t>
-            </w:r>
-          </w:p>
-        </w:tc>
-        <w:tc>
-          <w:tcPr>
-            <w:tcW w:type="dxa" w:w="5050"/>
+              <w:t xml:space="preserve">Monthly report</w:t>
+            </w:r>
+          </w:p>
+        </w:tc>
+        <w:tc>
+          <w:tcPr>
+            <w:tcW w:type="dxa" w:w="4600"/>
             <w:tcBorders>
               <w:top w:val="single" w:color="C9D2DE" w:sz="4"/>
               <w:left w:val="single" w:color="C9D2DE" w:sz="4"/>
@@ -4496,7 +4496,7 @@
         </w:tc>
         <w:tc>
           <w:tcPr>
-            <w:tcW w:type="dxa" w:w="3600"/>
+            <w:tcW w:type="dxa" w:w="3300"/>
             <w:tcBorders>
               <w:top w:val="single" w:color="C9D2DE" w:sz="4"/>
               <w:left w:val="single" w:color="C9D2DE" w:sz="4"/>
@@ -4534,7 +4534,7 @@
         </w:trPr>
         <w:tc>
           <w:tcPr>
-            <w:tcW w:type="dxa" w:w="1250"/>
+            <w:tcW w:type="dxa" w:w="2000"/>
             <w:tcBorders>
               <w:top w:val="single" w:color="C9D2DE" w:sz="4"/>
               <w:left w:val="single" w:color="C9D2DE" w:sz="4"/>
@@ -4562,13 +4562,13 @@
                 <w:sz w:val="19"/>
                 <w:szCs w:val="19"/>
               </w:rPr>
-              <w:t xml:space="preserve">FR-STA-02</w:t>
-            </w:r>
-          </w:p>
-        </w:tc>
-        <w:tc>
-          <w:tcPr>
-            <w:tcW w:type="dxa" w:w="5050"/>
+              <w:t xml:space="preserve">Automatic assignment</w:t>
+            </w:r>
+          </w:p>
+        </w:tc>
+        <w:tc>
+          <w:tcPr>
+            <w:tcW w:type="dxa" w:w="4600"/>
             <w:tcBorders>
               <w:top w:val="single" w:color="C9D2DE" w:sz="4"/>
               <w:left w:val="single" w:color="C9D2DE" w:sz="4"/>
@@ -4601,7 +4601,7 @@
         </w:tc>
         <w:tc>
           <w:tcPr>
-            <w:tcW w:type="dxa" w:w="3600"/>
+            <w:tcW w:type="dxa" w:w="3300"/>
             <w:tcBorders>
               <w:top w:val="single" w:color="C9D2DE" w:sz="4"/>
               <w:left w:val="single" w:color="C9D2DE" w:sz="4"/>
@@ -4639,7 +4639,7 @@
         </w:trPr>
         <w:tc>
           <w:tcPr>
-            <w:tcW w:type="dxa" w:w="1250"/>
+            <w:tcW w:type="dxa" w:w="2000"/>
             <w:tcBorders>
               <w:top w:val="single" w:color="C9D2DE" w:sz="4"/>
               <w:left w:val="single" w:color="C9D2DE" w:sz="4"/>
@@ -4667,13 +4667,13 @@
                 <w:sz w:val="19"/>
                 <w:szCs w:val="19"/>
               </w:rPr>
-              <w:t xml:space="preserve">FR-STA-03</w:t>
-            </w:r>
-          </w:p>
-        </w:tc>
-        <w:tc>
-          <w:tcPr>
-            <w:tcW w:type="dxa" w:w="5050"/>
+              <w:t xml:space="preserve">Automatic calculation</w:t>
+            </w:r>
+          </w:p>
+        </w:tc>
+        <w:tc>
+          <w:tcPr>
+            <w:tcW w:type="dxa" w:w="4600"/>
             <w:tcBorders>
               <w:top w:val="single" w:color="C9D2DE" w:sz="4"/>
               <w:left w:val="single" w:color="C9D2DE" w:sz="4"/>
@@ -4706,7 +4706,7 @@
         </w:tc>
         <w:tc>
           <w:tcPr>
-            <w:tcW w:type="dxa" w:w="3600"/>
+            <w:tcW w:type="dxa" w:w="3300"/>
             <w:tcBorders>
               <w:top w:val="single" w:color="C9D2DE" w:sz="4"/>
               <w:left w:val="single" w:color="C9D2DE" w:sz="4"/>
@@ -4744,7 +4744,7 @@
         </w:trPr>
         <w:tc>
           <w:tcPr>
-            <w:tcW w:type="dxa" w:w="1250"/>
+            <w:tcW w:type="dxa" w:w="2000"/>
             <w:tcBorders>
               <w:top w:val="single" w:color="C9D2DE" w:sz="4"/>
               <w:left w:val="single" w:color="C9D2DE" w:sz="4"/>
@@ -4772,13 +4772,13 @@
                 <w:sz w:val="19"/>
                 <w:szCs w:val="19"/>
               </w:rPr>
-              <w:t xml:space="preserve">FR-STA-04</w:t>
-            </w:r>
-          </w:p>
-        </w:tc>
-        <w:tc>
-          <w:tcPr>
-            <w:tcW w:type="dxa" w:w="5050"/>
+              <w:t xml:space="preserve">Targets and periods</w:t>
+            </w:r>
+          </w:p>
+        </w:tc>
+        <w:tc>
+          <w:tcPr>
+            <w:tcW w:type="dxa" w:w="4600"/>
             <w:tcBorders>
               <w:top w:val="single" w:color="C9D2DE" w:sz="4"/>
               <w:left w:val="single" w:color="C9D2DE" w:sz="4"/>
@@ -4811,7 +4811,7 @@
         </w:tc>
         <w:tc>
           <w:tcPr>
-            <w:tcW w:type="dxa" w:w="3600"/>
+            <w:tcW w:type="dxa" w:w="3300"/>
             <w:tcBorders>
               <w:top w:val="single" w:color="C9D2DE" w:sz="4"/>
               <w:left w:val="single" w:color="C9D2DE" w:sz="4"/>
@@ -4849,7 +4849,7 @@
         </w:trPr>
         <w:tc>
           <w:tcPr>
-            <w:tcW w:type="dxa" w:w="1250"/>
+            <w:tcW w:type="dxa" w:w="2000"/>
             <w:tcBorders>
               <w:top w:val="single" w:color="C9D2DE" w:sz="4"/>
               <w:left w:val="single" w:color="C9D2DE" w:sz="4"/>
@@ -4877,13 +4877,13 @@
                 <w:sz w:val="19"/>
                 <w:szCs w:val="19"/>
               </w:rPr>
-              <w:t xml:space="preserve">FR-STA-05</w:t>
-            </w:r>
-          </w:p>
-        </w:tc>
-        <w:tc>
-          <w:tcPr>
-            <w:tcW w:type="dxa" w:w="5050"/>
+              <w:t xml:space="preserve">Editable indicators</w:t>
+            </w:r>
+          </w:p>
+        </w:tc>
+        <w:tc>
+          <w:tcPr>
+            <w:tcW w:type="dxa" w:w="4600"/>
             <w:tcBorders>
               <w:top w:val="single" w:color="C9D2DE" w:sz="4"/>
               <w:left w:val="single" w:color="C9D2DE" w:sz="4"/>
@@ -4916,7 +4916,7 @@
         </w:tc>
         <w:tc>
           <w:tcPr>
-            <w:tcW w:type="dxa" w:w="3600"/>
+            <w:tcW w:type="dxa" w:w="3300"/>
             <w:tcBorders>
               <w:top w:val="single" w:color="C9D2DE" w:sz="4"/>
               <w:left w:val="single" w:color="C9D2DE" w:sz="4"/>
@@ -4954,7 +4954,7 @@
         </w:trPr>
         <w:tc>
           <w:tcPr>
-            <w:tcW w:type="dxa" w:w="1250"/>
+            <w:tcW w:type="dxa" w:w="2000"/>
             <w:tcBorders>
               <w:top w:val="single" w:color="C9D2DE" w:sz="4"/>
               <w:left w:val="single" w:color="C9D2DE" w:sz="4"/>
@@ -4982,13 +4982,13 @@
                 <w:sz w:val="19"/>
                 <w:szCs w:val="19"/>
               </w:rPr>
-              <w:t xml:space="preserve">FR-STA-06</w:t>
-            </w:r>
-          </w:p>
-        </w:tc>
-        <w:tc>
-          <w:tcPr>
-            <w:tcW w:type="dxa" w:w="5050"/>
+              <w:t xml:space="preserve">Line-by-line review</w:t>
+            </w:r>
+          </w:p>
+        </w:tc>
+        <w:tc>
+          <w:tcPr>
+            <w:tcW w:type="dxa" w:w="4600"/>
             <w:tcBorders>
               <w:top w:val="single" w:color="C9D2DE" w:sz="4"/>
               <w:left w:val="single" w:color="C9D2DE" w:sz="4"/>
@@ -5021,7 +5021,7 @@
         </w:tc>
         <w:tc>
           <w:tcPr>
-            <w:tcW w:type="dxa" w:w="3600"/>
+            <w:tcW w:type="dxa" w:w="3300"/>
             <w:tcBorders>
               <w:top w:val="single" w:color="C9D2DE" w:sz="4"/>
               <w:left w:val="single" w:color="C9D2DE" w:sz="4"/>
@@ -5059,7 +5059,7 @@
         </w:trPr>
         <w:tc>
           <w:tcPr>
-            <w:tcW w:type="dxa" w:w="1250"/>
+            <w:tcW w:type="dxa" w:w="2000"/>
             <w:tcBorders>
               <w:top w:val="single" w:color="C9D2DE" w:sz="4"/>
               <w:left w:val="single" w:color="C9D2DE" w:sz="4"/>
@@ -5087,13 +5087,13 @@
                 <w:sz w:val="19"/>
                 <w:szCs w:val="19"/>
               </w:rPr>
-              <w:t xml:space="preserve">FR-STA-07</w:t>
-            </w:r>
-          </w:p>
-        </w:tc>
-        <w:tc>
-          <w:tcPr>
-            <w:tcW w:type="dxa" w:w="5050"/>
+              <w:t xml:space="preserve">Dashboard</w:t>
+            </w:r>
+          </w:p>
+        </w:tc>
+        <w:tc>
+          <w:tcPr>
+            <w:tcW w:type="dxa" w:w="4600"/>
             <w:tcBorders>
               <w:top w:val="single" w:color="C9D2DE" w:sz="4"/>
               <w:left w:val="single" w:color="C9D2DE" w:sz="4"/>
@@ -5126,7 +5126,7 @@
         </w:tc>
         <w:tc>
           <w:tcPr>
-            <w:tcW w:type="dxa" w:w="3600"/>
+            <w:tcW w:type="dxa" w:w="3300"/>
             <w:tcBorders>
               <w:top w:val="single" w:color="C9D2DE" w:sz="4"/>
               <w:left w:val="single" w:color="C9D2DE" w:sz="4"/>
@@ -5302,9 +5302,9 @@
         </w:tblBorders>
       </w:tblPr>
       <w:tblGrid>
-        <w:gridCol w:w="1250"/>
-        <w:gridCol w:w="5050"/>
-        <w:gridCol w:w="3600"/>
+        <w:gridCol w:w="2000"/>
+        <w:gridCol w:w="4600"/>
+        <w:gridCol w:w="3300"/>
       </w:tblGrid>
       <w:tr>
         <w:trPr>
@@ -5313,7 +5313,7 @@
         </w:trPr>
         <w:tc>
           <w:tcPr>
-            <w:tcW w:type="dxa" w:w="1250"/>
+            <w:tcW w:type="dxa" w:w="2000"/>
             <w:tcBorders>
               <w:top w:val="single" w:color="C9D2DE" w:sz="4"/>
               <w:left w:val="single" w:color="C9D2DE" w:sz="4"/>
@@ -5342,13 +5342,13 @@
                 <w:sz w:val="19"/>
                 <w:szCs w:val="19"/>
               </w:rPr>
-              <w:t xml:space="preserve">ID</w:t>
-            </w:r>
-          </w:p>
-        </w:tc>
-        <w:tc>
-          <w:tcPr>
-            <w:tcW w:type="dxa" w:w="5050"/>
+              <w:t xml:space="preserve">Requirement</w:t>
+            </w:r>
+          </w:p>
+        </w:tc>
+        <w:tc>
+          <w:tcPr>
+            <w:tcW w:type="dxa" w:w="4600"/>
             <w:tcBorders>
               <w:top w:val="single" w:color="C9D2DE" w:sz="4"/>
               <w:left w:val="single" w:color="C9D2DE" w:sz="4"/>
@@ -5383,7 +5383,7 @@
         </w:tc>
         <w:tc>
           <w:tcPr>
-            <w:tcW w:type="dxa" w:w="3600"/>
+            <w:tcW w:type="dxa" w:w="3300"/>
             <w:tcBorders>
               <w:top w:val="single" w:color="C9D2DE" w:sz="4"/>
               <w:left w:val="single" w:color="C9D2DE" w:sz="4"/>
@@ -5423,7 +5423,7 @@
         </w:trPr>
         <w:tc>
           <w:tcPr>
-            <w:tcW w:type="dxa" w:w="1250"/>
+            <w:tcW w:type="dxa" w:w="2000"/>
             <w:tcBorders>
               <w:top w:val="single" w:color="C9D2DE" w:sz="4"/>
               <w:left w:val="single" w:color="C9D2DE" w:sz="4"/>
@@ -5451,13 +5451,13 @@
                 <w:sz w:val="19"/>
                 <w:szCs w:val="19"/>
               </w:rPr>
-              <w:t xml:space="preserve">FR-KPI-01</w:t>
-            </w:r>
-          </w:p>
-        </w:tc>
-        <w:tc>
-          <w:tcPr>
-            <w:tcW w:type="dxa" w:w="5050"/>
+              <w:t xml:space="preserve">Original checklist format</w:t>
+            </w:r>
+          </w:p>
+        </w:tc>
+        <w:tc>
+          <w:tcPr>
+            <w:tcW w:type="dxa" w:w="4600"/>
             <w:tcBorders>
               <w:top w:val="single" w:color="C9D2DE" w:sz="4"/>
               <w:left w:val="single" w:color="C9D2DE" w:sz="4"/>
@@ -5490,7 +5490,7 @@
         </w:tc>
         <w:tc>
           <w:tcPr>
-            <w:tcW w:type="dxa" w:w="3600"/>
+            <w:tcW w:type="dxa" w:w="3300"/>
             <w:tcBorders>
               <w:top w:val="single" w:color="C9D2DE" w:sz="4"/>
               <w:left w:val="single" w:color="C9D2DE" w:sz="4"/>
@@ -5528,7 +5528,7 @@
         </w:trPr>
         <w:tc>
           <w:tcPr>
-            <w:tcW w:type="dxa" w:w="1250"/>
+            <w:tcW w:type="dxa" w:w="2000"/>
             <w:tcBorders>
               <w:top w:val="single" w:color="C9D2DE" w:sz="4"/>
               <w:left w:val="single" w:color="C9D2DE" w:sz="4"/>
@@ -5556,13 +5556,13 @@
                 <w:sz w:val="19"/>
                 <w:szCs w:val="19"/>
               </w:rPr>
-              <w:t xml:space="preserve">FR-KPI-02</w:t>
-            </w:r>
-          </w:p>
-        </w:tc>
-        <w:tc>
-          <w:tcPr>
-            <w:tcW w:type="dxa" w:w="5050"/>
+              <w:t xml:space="preserve">Score validation</w:t>
+            </w:r>
+          </w:p>
+        </w:tc>
+        <w:tc>
+          <w:tcPr>
+            <w:tcW w:type="dxa" w:w="4600"/>
             <w:tcBorders>
               <w:top w:val="single" w:color="C9D2DE" w:sz="4"/>
               <w:left w:val="single" w:color="C9D2DE" w:sz="4"/>
@@ -5595,7 +5595,7 @@
         </w:tc>
         <w:tc>
           <w:tcPr>
-            <w:tcW w:type="dxa" w:w="3600"/>
+            <w:tcW w:type="dxa" w:w="3300"/>
             <w:tcBorders>
               <w:top w:val="single" w:color="C9D2DE" w:sz="4"/>
               <w:left w:val="single" w:color="C9D2DE" w:sz="4"/>
@@ -5633,7 +5633,7 @@
         </w:trPr>
         <w:tc>
           <w:tcPr>
-            <w:tcW w:type="dxa" w:w="1250"/>
+            <w:tcW w:type="dxa" w:w="2000"/>
             <w:tcBorders>
               <w:top w:val="single" w:color="C9D2DE" w:sz="4"/>
               <w:left w:val="single" w:color="C9D2DE" w:sz="4"/>
@@ -5661,13 +5661,13 @@
                 <w:sz w:val="19"/>
                 <w:szCs w:val="19"/>
               </w:rPr>
-              <w:t xml:space="preserve">FR-KPI-03</w:t>
-            </w:r>
-          </w:p>
-        </w:tc>
-        <w:tc>
-          <w:tcPr>
-            <w:tcW w:type="dxa" w:w="5050"/>
+              <w:t xml:space="preserve">Completeness check</w:t>
+            </w:r>
+          </w:p>
+        </w:tc>
+        <w:tc>
+          <w:tcPr>
+            <w:tcW w:type="dxa" w:w="4600"/>
             <w:tcBorders>
               <w:top w:val="single" w:color="C9D2DE" w:sz="4"/>
               <w:left w:val="single" w:color="C9D2DE" w:sz="4"/>
@@ -5700,7 +5700,7 @@
         </w:tc>
         <w:tc>
           <w:tcPr>
-            <w:tcW w:type="dxa" w:w="3600"/>
+            <w:tcW w:type="dxa" w:w="3300"/>
             <w:tcBorders>
               <w:top w:val="single" w:color="C9D2DE" w:sz="4"/>
               <w:left w:val="single" w:color="C9D2DE" w:sz="4"/>
@@ -5738,7 +5738,7 @@
         </w:trPr>
         <w:tc>
           <w:tcPr>
-            <w:tcW w:type="dxa" w:w="1250"/>
+            <w:tcW w:type="dxa" w:w="2000"/>
             <w:tcBorders>
               <w:top w:val="single" w:color="C9D2DE" w:sz="4"/>
               <w:left w:val="single" w:color="C9D2DE" w:sz="4"/>
@@ -5766,13 +5766,13 @@
                 <w:sz w:val="19"/>
                 <w:szCs w:val="19"/>
               </w:rPr>
-              <w:t xml:space="preserve">FR-KPI-04</w:t>
-            </w:r>
-          </w:p>
-        </w:tc>
-        <w:tc>
-          <w:tcPr>
-            <w:tcW w:type="dxa" w:w="5050"/>
+              <w:t xml:space="preserve">Total score</w:t>
+            </w:r>
+          </w:p>
+        </w:tc>
+        <w:tc>
+          <w:tcPr>
+            <w:tcW w:type="dxa" w:w="4600"/>
             <w:tcBorders>
               <w:top w:val="single" w:color="C9D2DE" w:sz="4"/>
               <w:left w:val="single" w:color="C9D2DE" w:sz="4"/>
@@ -5805,7 +5805,7 @@
         </w:tc>
         <w:tc>
           <w:tcPr>
-            <w:tcW w:type="dxa" w:w="3600"/>
+            <w:tcW w:type="dxa" w:w="3300"/>
             <w:tcBorders>
               <w:top w:val="single" w:color="C9D2DE" w:sz="4"/>
               <w:left w:val="single" w:color="C9D2DE" w:sz="4"/>
@@ -5843,7 +5843,7 @@
         </w:trPr>
         <w:tc>
           <w:tcPr>
-            <w:tcW w:type="dxa" w:w="1250"/>
+            <w:tcW w:type="dxa" w:w="2000"/>
             <w:tcBorders>
               <w:top w:val="single" w:color="C9D2DE" w:sz="4"/>
               <w:left w:val="single" w:color="C9D2DE" w:sz="4"/>
@@ -5871,13 +5871,13 @@
                 <w:sz w:val="19"/>
                 <w:szCs w:val="19"/>
               </w:rPr>
-              <w:t xml:space="preserve">FR-KPI-05</w:t>
-            </w:r>
-          </w:p>
-        </w:tc>
-        <w:tc>
-          <w:tcPr>
-            <w:tcW w:type="dxa" w:w="5050"/>
+              <w:t xml:space="preserve">Monthly automation</w:t>
+            </w:r>
+          </w:p>
+        </w:tc>
+        <w:tc>
+          <w:tcPr>
+            <w:tcW w:type="dxa" w:w="4600"/>
             <w:tcBorders>
               <w:top w:val="single" w:color="C9D2DE" w:sz="4"/>
               <w:left w:val="single" w:color="C9D2DE" w:sz="4"/>
@@ -5910,7 +5910,7 @@
         </w:tc>
         <w:tc>
           <w:tcPr>
-            <w:tcW w:type="dxa" w:w="3600"/>
+            <w:tcW w:type="dxa" w:w="3300"/>
             <w:tcBorders>
               <w:top w:val="single" w:color="C9D2DE" w:sz="4"/>
               <w:left w:val="single" w:color="C9D2DE" w:sz="4"/>
@@ -5948,7 +5948,7 @@
         </w:trPr>
         <w:tc>
           <w:tcPr>
-            <w:tcW w:type="dxa" w:w="1250"/>
+            <w:tcW w:type="dxa" w:w="2000"/>
             <w:tcBorders>
               <w:top w:val="single" w:color="C9D2DE" w:sz="4"/>
               <w:left w:val="single" w:color="C9D2DE" w:sz="4"/>
@@ -5976,13 +5976,13 @@
                 <w:sz w:val="19"/>
                 <w:szCs w:val="19"/>
               </w:rPr>
-              <w:t xml:space="preserve">FR-KPI-06</w:t>
-            </w:r>
-          </w:p>
-        </w:tc>
-        <w:tc>
-          <w:tcPr>
-            <w:tcW w:type="dxa" w:w="5050"/>
+              <w:t xml:space="preserve">Templates and dashboard</w:t>
+            </w:r>
+          </w:p>
+        </w:tc>
+        <w:tc>
+          <w:tcPr>
+            <w:tcW w:type="dxa" w:w="4600"/>
             <w:tcBorders>
               <w:top w:val="single" w:color="C9D2DE" w:sz="4"/>
               <w:left w:val="single" w:color="C9D2DE" w:sz="4"/>
@@ -6015,7 +6015,7 @@
         </w:tc>
         <w:tc>
           <w:tcPr>
-            <w:tcW w:type="dxa" w:w="3600"/>
+            <w:tcW w:type="dxa" w:w="3300"/>
             <w:tcBorders>
               <w:top w:val="single" w:color="C9D2DE" w:sz="4"/>
               <w:left w:val="single" w:color="C9D2DE" w:sz="4"/>
@@ -6191,9 +6191,9 @@
         </w:tblBorders>
       </w:tblPr>
       <w:tblGrid>
-        <w:gridCol w:w="1250"/>
-        <w:gridCol w:w="5050"/>
-        <w:gridCol w:w="3600"/>
+        <w:gridCol w:w="2000"/>
+        <w:gridCol w:w="4600"/>
+        <w:gridCol w:w="3300"/>
       </w:tblGrid>
       <w:tr>
         <w:trPr>
@@ -6202,7 +6202,7 @@
         </w:trPr>
         <w:tc>
           <w:tcPr>
-            <w:tcW w:type="dxa" w:w="1250"/>
+            <w:tcW w:type="dxa" w:w="2000"/>
             <w:tcBorders>
               <w:top w:val="single" w:color="C9D2DE" w:sz="4"/>
               <w:left w:val="single" w:color="C9D2DE" w:sz="4"/>
@@ -6231,13 +6231,13 @@
                 <w:sz w:val="19"/>
                 <w:szCs w:val="19"/>
               </w:rPr>
-              <w:t xml:space="preserve">ID</w:t>
-            </w:r>
-          </w:p>
-        </w:tc>
-        <w:tc>
-          <w:tcPr>
-            <w:tcW w:type="dxa" w:w="5050"/>
+              <w:t xml:space="preserve">Requirement</w:t>
+            </w:r>
+          </w:p>
+        </w:tc>
+        <w:tc>
+          <w:tcPr>
+            <w:tcW w:type="dxa" w:w="4600"/>
             <w:tcBorders>
               <w:top w:val="single" w:color="C9D2DE" w:sz="4"/>
               <w:left w:val="single" w:color="C9D2DE" w:sz="4"/>
@@ -6272,7 +6272,7 @@
         </w:tc>
         <w:tc>
           <w:tcPr>
-            <w:tcW w:type="dxa" w:w="3600"/>
+            <w:tcW w:type="dxa" w:w="3300"/>
             <w:tcBorders>
               <w:top w:val="single" w:color="C9D2DE" w:sz="4"/>
               <w:left w:val="single" w:color="C9D2DE" w:sz="4"/>
@@ -6312,7 +6312,7 @@
         </w:trPr>
         <w:tc>
           <w:tcPr>
-            <w:tcW w:type="dxa" w:w="1250"/>
+            <w:tcW w:type="dxa" w:w="2000"/>
             <w:tcBorders>
               <w:top w:val="single" w:color="C9D2DE" w:sz="4"/>
               <w:left w:val="single" w:color="C9D2DE" w:sz="4"/>
@@ -6340,13 +6340,13 @@
                 <w:sz w:val="19"/>
                 <w:szCs w:val="19"/>
               </w:rPr>
-              <w:t xml:space="preserve">FR-INC-01</w:t>
-            </w:r>
-          </w:p>
-        </w:tc>
-        <w:tc>
-          <w:tcPr>
-            <w:tcW w:type="dxa" w:w="5050"/>
+              <w:t xml:space="preserve">Event reporting and severity</w:t>
+            </w:r>
+          </w:p>
+        </w:tc>
+        <w:tc>
+          <w:tcPr>
+            <w:tcW w:type="dxa" w:w="4600"/>
             <w:tcBorders>
               <w:top w:val="single" w:color="C9D2DE" w:sz="4"/>
               <w:left w:val="single" w:color="C9D2DE" w:sz="4"/>
@@ -6379,7 +6379,7 @@
         </w:tc>
         <w:tc>
           <w:tcPr>
-            <w:tcW w:type="dxa" w:w="3600"/>
+            <w:tcW w:type="dxa" w:w="3300"/>
             <w:tcBorders>
               <w:top w:val="single" w:color="C9D2DE" w:sz="4"/>
               <w:left w:val="single" w:color="C9D2DE" w:sz="4"/>
@@ -6417,7 +6417,7 @@
         </w:trPr>
         <w:tc>
           <w:tcPr>
-            <w:tcW w:type="dxa" w:w="1250"/>
+            <w:tcW w:type="dxa" w:w="2000"/>
             <w:tcBorders>
               <w:top w:val="single" w:color="C9D2DE" w:sz="4"/>
               <w:left w:val="single" w:color="C9D2DE" w:sz="4"/>
@@ -6445,13 +6445,13 @@
                 <w:sz w:val="19"/>
                 <w:szCs w:val="19"/>
               </w:rPr>
-              <w:t xml:space="preserve">FR-INC-02</w:t>
-            </w:r>
-          </w:p>
-        </w:tc>
-        <w:tc>
-          <w:tcPr>
-            <w:tcW w:type="dxa" w:w="5050"/>
+              <w:t xml:space="preserve">Investigation deadlines</w:t>
+            </w:r>
+          </w:p>
+        </w:tc>
+        <w:tc>
+          <w:tcPr>
+            <w:tcW w:type="dxa" w:w="4600"/>
             <w:tcBorders>
               <w:top w:val="single" w:color="C9D2DE" w:sz="4"/>
               <w:left w:val="single" w:color="C9D2DE" w:sz="4"/>
@@ -6484,7 +6484,7 @@
         </w:tc>
         <w:tc>
           <w:tcPr>
-            <w:tcW w:type="dxa" w:w="3600"/>
+            <w:tcW w:type="dxa" w:w="3300"/>
             <w:tcBorders>
               <w:top w:val="single" w:color="C9D2DE" w:sz="4"/>
               <w:left w:val="single" w:color="C9D2DE" w:sz="4"/>
@@ -6522,7 +6522,7 @@
         </w:trPr>
         <w:tc>
           <w:tcPr>
-            <w:tcW w:type="dxa" w:w="1250"/>
+            <w:tcW w:type="dxa" w:w="2000"/>
             <w:tcBorders>
               <w:top w:val="single" w:color="C9D2DE" w:sz="4"/>
               <w:left w:val="single" w:color="C9D2DE" w:sz="4"/>
@@ -6550,13 +6550,13 @@
                 <w:sz w:val="19"/>
                 <w:szCs w:val="19"/>
               </w:rPr>
-              <w:t xml:space="preserve">FR-INC-03</w:t>
-            </w:r>
-          </w:p>
-        </w:tc>
-        <w:tc>
-          <w:tcPr>
-            <w:tcW w:type="dxa" w:w="5050"/>
+              <w:t xml:space="preserve">Single case file</w:t>
+            </w:r>
+          </w:p>
+        </w:tc>
+        <w:tc>
+          <w:tcPr>
+            <w:tcW w:type="dxa" w:w="4600"/>
             <w:tcBorders>
               <w:top w:val="single" w:color="C9D2DE" w:sz="4"/>
               <w:left w:val="single" w:color="C9D2DE" w:sz="4"/>
@@ -6589,7 +6589,7 @@
         </w:tc>
         <w:tc>
           <w:tcPr>
-            <w:tcW w:type="dxa" w:w="3600"/>
+            <w:tcW w:type="dxa" w:w="3300"/>
             <w:tcBorders>
               <w:top w:val="single" w:color="C9D2DE" w:sz="4"/>
               <w:left w:val="single" w:color="C9D2DE" w:sz="4"/>
@@ -6627,7 +6627,7 @@
         </w:trPr>
         <w:tc>
           <w:tcPr>
-            <w:tcW w:type="dxa" w:w="1250"/>
+            <w:tcW w:type="dxa" w:w="2000"/>
             <w:tcBorders>
               <w:top w:val="single" w:color="C9D2DE" w:sz="4"/>
               <w:left w:val="single" w:color="C9D2DE" w:sz="4"/>
@@ -6655,13 +6655,13 @@
                 <w:sz w:val="19"/>
                 <w:szCs w:val="19"/>
               </w:rPr>
-              <w:t xml:space="preserve">FR-INC-04</w:t>
-            </w:r>
-          </w:p>
-        </w:tc>
-        <w:tc>
-          <w:tcPr>
-            <w:tcW w:type="dxa" w:w="5050"/>
+              <w:t xml:space="preserve">Review and approval</w:t>
+            </w:r>
+          </w:p>
+        </w:tc>
+        <w:tc>
+          <w:tcPr>
+            <w:tcW w:type="dxa" w:w="4600"/>
             <w:tcBorders>
               <w:top w:val="single" w:color="C9D2DE" w:sz="4"/>
               <w:left w:val="single" w:color="C9D2DE" w:sz="4"/>
@@ -6694,7 +6694,7 @@
         </w:tc>
         <w:tc>
           <w:tcPr>
-            <w:tcW w:type="dxa" w:w="3600"/>
+            <w:tcW w:type="dxa" w:w="3300"/>
             <w:tcBorders>
               <w:top w:val="single" w:color="C9D2DE" w:sz="4"/>
               <w:left w:val="single" w:color="C9D2DE" w:sz="4"/>
@@ -6732,7 +6732,7 @@
         </w:trPr>
         <w:tc>
           <w:tcPr>
-            <w:tcW w:type="dxa" w:w="1250"/>
+            <w:tcW w:type="dxa" w:w="2000"/>
             <w:tcBorders>
               <w:top w:val="single" w:color="C9D2DE" w:sz="4"/>
               <w:left w:val="single" w:color="C9D2DE" w:sz="4"/>
@@ -6760,13 +6760,13 @@
                 <w:sz w:val="19"/>
                 <w:szCs w:val="19"/>
               </w:rPr>
-              <w:t xml:space="preserve">FR-INC-05</w:t>
-            </w:r>
-          </w:p>
-        </w:tc>
-        <w:tc>
-          <w:tcPr>
-            <w:tcW w:type="dxa" w:w="5050"/>
+              <w:t xml:space="preserve">Word report</w:t>
+            </w:r>
+          </w:p>
+        </w:tc>
+        <w:tc>
+          <w:tcPr>
+            <w:tcW w:type="dxa" w:w="4600"/>
             <w:tcBorders>
               <w:top w:val="single" w:color="C9D2DE" w:sz="4"/>
               <w:left w:val="single" w:color="C9D2DE" w:sz="4"/>
@@ -6799,7 +6799,7 @@
         </w:tc>
         <w:tc>
           <w:tcPr>
-            <w:tcW w:type="dxa" w:w="3600"/>
+            <w:tcW w:type="dxa" w:w="3300"/>
             <w:tcBorders>
               <w:top w:val="single" w:color="C9D2DE" w:sz="4"/>
               <w:left w:val="single" w:color="C9D2DE" w:sz="4"/>
@@ -6837,7 +6837,7 @@
         </w:trPr>
         <w:tc>
           <w:tcPr>
-            <w:tcW w:type="dxa" w:w="1250"/>
+            <w:tcW w:type="dxa" w:w="2000"/>
             <w:tcBorders>
               <w:top w:val="single" w:color="C9D2DE" w:sz="4"/>
               <w:left w:val="single" w:color="C9D2DE" w:sz="4"/>
@@ -6865,13 +6865,13 @@
                 <w:sz w:val="19"/>
                 <w:szCs w:val="19"/>
               </w:rPr>
-              <w:t xml:space="preserve">FR-INC-06</w:t>
-            </w:r>
-          </w:p>
-        </w:tc>
-        <w:tc>
-          <w:tcPr>
-            <w:tcW w:type="dxa" w:w="5050"/>
+              <w:t xml:space="preserve">No deletion</w:t>
+            </w:r>
+          </w:p>
+        </w:tc>
+        <w:tc>
+          <w:tcPr>
+            <w:tcW w:type="dxa" w:w="4600"/>
             <w:tcBorders>
               <w:top w:val="single" w:color="C9D2DE" w:sz="4"/>
               <w:left w:val="single" w:color="C9D2DE" w:sz="4"/>
@@ -6904,7 +6904,7 @@
         </w:tc>
         <w:tc>
           <w:tcPr>
-            <w:tcW w:type="dxa" w:w="3600"/>
+            <w:tcW w:type="dxa" w:w="3300"/>
             <w:tcBorders>
               <w:top w:val="single" w:color="C9D2DE" w:sz="4"/>
               <w:left w:val="single" w:color="C9D2DE" w:sz="4"/>
@@ -6942,7 +6942,7 @@
         </w:trPr>
         <w:tc>
           <w:tcPr>
-            <w:tcW w:type="dxa" w:w="1250"/>
+            <w:tcW w:type="dxa" w:w="2000"/>
             <w:tcBorders>
               <w:top w:val="single" w:color="C9D2DE" w:sz="4"/>
               <w:left w:val="single" w:color="C9D2DE" w:sz="4"/>
@@ -6970,13 +6970,13 @@
                 <w:sz w:val="19"/>
                 <w:szCs w:val="19"/>
               </w:rPr>
-              <w:t xml:space="preserve">FR-INC-07</w:t>
-            </w:r>
-          </w:p>
-        </w:tc>
-        <w:tc>
-          <w:tcPr>
-            <w:tcW w:type="dxa" w:w="5050"/>
+              <w:t xml:space="preserve">Statistics link</w:t>
+            </w:r>
+          </w:p>
+        </w:tc>
+        <w:tc>
+          <w:tcPr>
+            <w:tcW w:type="dxa" w:w="4600"/>
             <w:tcBorders>
               <w:top w:val="single" w:color="C9D2DE" w:sz="4"/>
               <w:left w:val="single" w:color="C9D2DE" w:sz="4"/>
@@ -7009,7 +7009,7 @@
         </w:tc>
         <w:tc>
           <w:tcPr>
-            <w:tcW w:type="dxa" w:w="3600"/>
+            <w:tcW w:type="dxa" w:w="3300"/>
             <w:tcBorders>
               <w:top w:val="single" w:color="C9D2DE" w:sz="4"/>
               <w:left w:val="single" w:color="C9D2DE" w:sz="4"/>
@@ -7185,9 +7185,9 @@
         </w:tblBorders>
       </w:tblPr>
       <w:tblGrid>
-        <w:gridCol w:w="1250"/>
-        <w:gridCol w:w="5050"/>
-        <w:gridCol w:w="3600"/>
+        <w:gridCol w:w="2000"/>
+        <w:gridCol w:w="4600"/>
+        <w:gridCol w:w="3300"/>
       </w:tblGrid>
       <w:tr>
         <w:trPr>
@@ -7196,7 +7196,7 @@
         </w:trPr>
         <w:tc>
           <w:tcPr>
-            <w:tcW w:type="dxa" w:w="1250"/>
+            <w:tcW w:type="dxa" w:w="2000"/>
             <w:tcBorders>
               <w:top w:val="single" w:color="C9D2DE" w:sz="4"/>
               <w:left w:val="single" w:color="C9D2DE" w:sz="4"/>
@@ -7225,13 +7225,13 @@
                 <w:sz w:val="19"/>
                 <w:szCs w:val="19"/>
               </w:rPr>
-              <w:t xml:space="preserve">ID</w:t>
-            </w:r>
-          </w:p>
-        </w:tc>
-        <w:tc>
-          <w:tcPr>
-            <w:tcW w:type="dxa" w:w="5050"/>
+              <w:t xml:space="preserve">Requirement</w:t>
+            </w:r>
+          </w:p>
+        </w:tc>
+        <w:tc>
+          <w:tcPr>
+            <w:tcW w:type="dxa" w:w="4600"/>
             <w:tcBorders>
               <w:top w:val="single" w:color="C9D2DE" w:sz="4"/>
               <w:left w:val="single" w:color="C9D2DE" w:sz="4"/>
@@ -7266,7 +7266,7 @@
         </w:tc>
         <w:tc>
           <w:tcPr>
-            <w:tcW w:type="dxa" w:w="3600"/>
+            <w:tcW w:type="dxa" w:w="3300"/>
             <w:tcBorders>
               <w:top w:val="single" w:color="C9D2DE" w:sz="4"/>
               <w:left w:val="single" w:color="C9D2DE" w:sz="4"/>
@@ -7306,7 +7306,7 @@
         </w:trPr>
         <w:tc>
           <w:tcPr>
-            <w:tcW w:type="dxa" w:w="1250"/>
+            <w:tcW w:type="dxa" w:w="2000"/>
             <w:tcBorders>
               <w:top w:val="single" w:color="C9D2DE" w:sz="4"/>
               <w:left w:val="single" w:color="C9D2DE" w:sz="4"/>
@@ -7334,13 +7334,13 @@
                 <w:sz w:val="19"/>
                 <w:szCs w:val="19"/>
               </w:rPr>
-              <w:t xml:space="preserve">FR-OBS-01</w:t>
-            </w:r>
-          </w:p>
-        </w:tc>
-        <w:tc>
-          <w:tcPr>
-            <w:tcW w:type="dxa" w:w="5050"/>
+              <w:t xml:space="preserve">Easy reporting</w:t>
+            </w:r>
+          </w:p>
+        </w:tc>
+        <w:tc>
+          <w:tcPr>
+            <w:tcW w:type="dxa" w:w="4600"/>
             <w:tcBorders>
               <w:top w:val="single" w:color="C9D2DE" w:sz="4"/>
               <w:left w:val="single" w:color="C9D2DE" w:sz="4"/>
@@ -7373,7 +7373,7 @@
         </w:tc>
         <w:tc>
           <w:tcPr>
-            <w:tcW w:type="dxa" w:w="3600"/>
+            <w:tcW w:type="dxa" w:w="3300"/>
             <w:tcBorders>
               <w:top w:val="single" w:color="C9D2DE" w:sz="4"/>
               <w:left w:val="single" w:color="C9D2DE" w:sz="4"/>
@@ -7411,7 +7411,7 @@
         </w:trPr>
         <w:tc>
           <w:tcPr>
-            <w:tcW w:type="dxa" w:w="1250"/>
+            <w:tcW w:type="dxa" w:w="2000"/>
             <w:tcBorders>
               <w:top w:val="single" w:color="C9D2DE" w:sz="4"/>
               <w:left w:val="single" w:color="C9D2DE" w:sz="4"/>
@@ -7439,13 +7439,13 @@
                 <w:sz w:val="19"/>
                 <w:szCs w:val="19"/>
               </w:rPr>
-              <w:t xml:space="preserve">FR-OBS-02</w:t>
-            </w:r>
-          </w:p>
-        </w:tc>
-        <w:tc>
-          <w:tcPr>
-            <w:tcW w:type="dxa" w:w="5050"/>
+              <w:t xml:space="preserve">Priority deadlines</w:t>
+            </w:r>
+          </w:p>
+        </w:tc>
+        <w:tc>
+          <w:tcPr>
+            <w:tcW w:type="dxa" w:w="4600"/>
             <w:tcBorders>
               <w:top w:val="single" w:color="C9D2DE" w:sz="4"/>
               <w:left w:val="single" w:color="C9D2DE" w:sz="4"/>
@@ -7478,7 +7478,7 @@
         </w:tc>
         <w:tc>
           <w:tcPr>
-            <w:tcW w:type="dxa" w:w="3600"/>
+            <w:tcW w:type="dxa" w:w="3300"/>
             <w:tcBorders>
               <w:top w:val="single" w:color="C9D2DE" w:sz="4"/>
               <w:left w:val="single" w:color="C9D2DE" w:sz="4"/>
@@ -7516,7 +7516,7 @@
         </w:trPr>
         <w:tc>
           <w:tcPr>
-            <w:tcW w:type="dxa" w:w="1250"/>
+            <w:tcW w:type="dxa" w:w="2000"/>
             <w:tcBorders>
               <w:top w:val="single" w:color="C9D2DE" w:sz="4"/>
               <w:left w:val="single" w:color="C9D2DE" w:sz="4"/>
@@ -7544,13 +7544,13 @@
                 <w:sz w:val="19"/>
                 <w:szCs w:val="19"/>
               </w:rPr>
-              <w:t xml:space="preserve">FR-OBS-03</w:t>
-            </w:r>
-          </w:p>
-        </w:tc>
-        <w:tc>
-          <w:tcPr>
-            <w:tcW w:type="dxa" w:w="5050"/>
+              <w:t xml:space="preserve">Discussion and evidence</w:t>
+            </w:r>
+          </w:p>
+        </w:tc>
+        <w:tc>
+          <w:tcPr>
+            <w:tcW w:type="dxa" w:w="4600"/>
             <w:tcBorders>
               <w:top w:val="single" w:color="C9D2DE" w:sz="4"/>
               <w:left w:val="single" w:color="C9D2DE" w:sz="4"/>
@@ -7583,7 +7583,7 @@
         </w:tc>
         <w:tc>
           <w:tcPr>
-            <w:tcW w:type="dxa" w:w="3600"/>
+            <w:tcW w:type="dxa" w:w="3300"/>
             <w:tcBorders>
               <w:top w:val="single" w:color="C9D2DE" w:sz="4"/>
               <w:left w:val="single" w:color="C9D2DE" w:sz="4"/>
@@ -7621,7 +7621,7 @@
         </w:trPr>
         <w:tc>
           <w:tcPr>
-            <w:tcW w:type="dxa" w:w="1250"/>
+            <w:tcW w:type="dxa" w:w="2000"/>
             <w:tcBorders>
               <w:top w:val="single" w:color="C9D2DE" w:sz="4"/>
               <w:left w:val="single" w:color="C9D2DE" w:sz="4"/>
@@ -7649,13 +7649,13 @@
                 <w:sz w:val="19"/>
                 <w:szCs w:val="19"/>
               </w:rPr>
-              <w:t xml:space="preserve">FR-OBS-04</w:t>
-            </w:r>
-          </w:p>
-        </w:tc>
-        <w:tc>
-          <w:tcPr>
-            <w:tcW w:type="dxa" w:w="5050"/>
+              <w:t xml:space="preserve">Validated close-out</w:t>
+            </w:r>
+          </w:p>
+        </w:tc>
+        <w:tc>
+          <w:tcPr>
+            <w:tcW w:type="dxa" w:w="4600"/>
             <w:tcBorders>
               <w:top w:val="single" w:color="C9D2DE" w:sz="4"/>
               <w:left w:val="single" w:color="C9D2DE" w:sz="4"/>
@@ -7688,7 +7688,7 @@
         </w:tc>
         <w:tc>
           <w:tcPr>
-            <w:tcW w:type="dxa" w:w="3600"/>
+            <w:tcW w:type="dxa" w:w="3300"/>
             <w:tcBorders>
               <w:top w:val="single" w:color="C9D2DE" w:sz="4"/>
               <w:left w:val="single" w:color="C9D2DE" w:sz="4"/>
@@ -7726,7 +7726,7 @@
         </w:trPr>
         <w:tc>
           <w:tcPr>
-            <w:tcW w:type="dxa" w:w="1250"/>
+            <w:tcW w:type="dxa" w:w="2000"/>
             <w:tcBorders>
               <w:top w:val="single" w:color="C9D2DE" w:sz="4"/>
               <w:left w:val="single" w:color="C9D2DE" w:sz="4"/>
@@ -7754,13 +7754,13 @@
                 <w:sz w:val="19"/>
                 <w:szCs w:val="19"/>
               </w:rPr>
-              <w:t xml:space="preserve">FR-OBS-05</w:t>
-            </w:r>
-          </w:p>
-        </w:tc>
-        <w:tc>
-          <w:tcPr>
-            <w:tcW w:type="dxa" w:w="5050"/>
+              <w:t xml:space="preserve">Inspections and reports</w:t>
+            </w:r>
+          </w:p>
+        </w:tc>
+        <w:tc>
+          <w:tcPr>
+            <w:tcW w:type="dxa" w:w="4600"/>
             <w:tcBorders>
               <w:top w:val="single" w:color="C9D2DE" w:sz="4"/>
               <w:left w:val="single" w:color="C9D2DE" w:sz="4"/>
@@ -7793,7 +7793,7 @@
         </w:tc>
         <w:tc>
           <w:tcPr>
-            <w:tcW w:type="dxa" w:w="3600"/>
+            <w:tcW w:type="dxa" w:w="3300"/>
             <w:tcBorders>
               <w:top w:val="single" w:color="C9D2DE" w:sz="4"/>
               <w:left w:val="single" w:color="C9D2DE" w:sz="4"/>
@@ -7831,7 +7831,7 @@
         </w:trPr>
         <w:tc>
           <w:tcPr>
-            <w:tcW w:type="dxa" w:w="1250"/>
+            <w:tcW w:type="dxa" w:w="2000"/>
             <w:tcBorders>
               <w:top w:val="single" w:color="C9D2DE" w:sz="4"/>
               <w:left w:val="single" w:color="C9D2DE" w:sz="4"/>
@@ -7859,13 +7859,13 @@
                 <w:sz w:val="19"/>
                 <w:szCs w:val="19"/>
               </w:rPr>
-              <w:t xml:space="preserve">FR-OBS-06</w:t>
-            </w:r>
-          </w:p>
-        </w:tc>
-        <w:tc>
-          <w:tcPr>
-            <w:tcW w:type="dxa" w:w="5050"/>
+              <w:t xml:space="preserve">No deletion</w:t>
+            </w:r>
+          </w:p>
+        </w:tc>
+        <w:tc>
+          <w:tcPr>
+            <w:tcW w:type="dxa" w:w="4600"/>
             <w:tcBorders>
               <w:top w:val="single" w:color="C9D2DE" w:sz="4"/>
               <w:left w:val="single" w:color="C9D2DE" w:sz="4"/>
@@ -7898,7 +7898,7 @@
         </w:tc>
         <w:tc>
           <w:tcPr>
-            <w:tcW w:type="dxa" w:w="3600"/>
+            <w:tcW w:type="dxa" w:w="3300"/>
             <w:tcBorders>
               <w:top w:val="single" w:color="C9D2DE" w:sz="4"/>
               <w:left w:val="single" w:color="C9D2DE" w:sz="4"/>
@@ -8074,9 +8074,9 @@
         </w:tblBorders>
       </w:tblPr>
       <w:tblGrid>
-        <w:gridCol w:w="1250"/>
-        <w:gridCol w:w="5050"/>
-        <w:gridCol w:w="3600"/>
+        <w:gridCol w:w="2000"/>
+        <w:gridCol w:w="4600"/>
+        <w:gridCol w:w="3300"/>
       </w:tblGrid>
       <w:tr>
         <w:trPr>
@@ -8085,7 +8085,7 @@
         </w:trPr>
         <w:tc>
           <w:tcPr>
-            <w:tcW w:type="dxa" w:w="1250"/>
+            <w:tcW w:type="dxa" w:w="2000"/>
             <w:tcBorders>
               <w:top w:val="single" w:color="C9D2DE" w:sz="4"/>
               <w:left w:val="single" w:color="C9D2DE" w:sz="4"/>
@@ -8114,13 +8114,13 @@
                 <w:sz w:val="19"/>
                 <w:szCs w:val="19"/>
               </w:rPr>
-              <w:t xml:space="preserve">ID</w:t>
-            </w:r>
-          </w:p>
-        </w:tc>
-        <w:tc>
-          <w:tcPr>
-            <w:tcW w:type="dxa" w:w="5050"/>
+              <w:t xml:space="preserve">Requirement</w:t>
+            </w:r>
+          </w:p>
+        </w:tc>
+        <w:tc>
+          <w:tcPr>
+            <w:tcW w:type="dxa" w:w="4600"/>
             <w:tcBorders>
               <w:top w:val="single" w:color="C9D2DE" w:sz="4"/>
               <w:left w:val="single" w:color="C9D2DE" w:sz="4"/>
@@ -8155,7 +8155,7 @@
         </w:tc>
         <w:tc>
           <w:tcPr>
-            <w:tcW w:type="dxa" w:w="3600"/>
+            <w:tcW w:type="dxa" w:w="3300"/>
             <w:tcBorders>
               <w:top w:val="single" w:color="C9D2DE" w:sz="4"/>
               <w:left w:val="single" w:color="C9D2DE" w:sz="4"/>
@@ -8195,7 +8195,7 @@
         </w:trPr>
         <w:tc>
           <w:tcPr>
-            <w:tcW w:type="dxa" w:w="1250"/>
+            <w:tcW w:type="dxa" w:w="2000"/>
             <w:tcBorders>
               <w:top w:val="single" w:color="C9D2DE" w:sz="4"/>
               <w:left w:val="single" w:color="C9D2DE" w:sz="4"/>
@@ -8223,13 +8223,13 @@
                 <w:sz w:val="19"/>
                 <w:szCs w:val="19"/>
               </w:rPr>
-              <w:t xml:space="preserve">FR-TI-01</w:t>
-            </w:r>
-          </w:p>
-        </w:tc>
-        <w:tc>
-          <w:tcPr>
-            <w:tcW w:type="dxa" w:w="5050"/>
+              <w:t xml:space="preserve">Catalogue-based instruction</w:t>
+            </w:r>
+          </w:p>
+        </w:tc>
+        <w:tc>
+          <w:tcPr>
+            <w:tcW w:type="dxa" w:w="4600"/>
             <w:tcBorders>
               <w:top w:val="single" w:color="C9D2DE" w:sz="4"/>
               <w:left w:val="single" w:color="C9D2DE" w:sz="4"/>
@@ -8262,7 +8262,7 @@
         </w:tc>
         <w:tc>
           <w:tcPr>
-            <w:tcW w:type="dxa" w:w="3600"/>
+            <w:tcW w:type="dxa" w:w="3300"/>
             <w:tcBorders>
               <w:top w:val="single" w:color="C9D2DE" w:sz="4"/>
               <w:left w:val="single" w:color="C9D2DE" w:sz="4"/>
@@ -8300,7 +8300,7 @@
         </w:trPr>
         <w:tc>
           <w:tcPr>
-            <w:tcW w:type="dxa" w:w="1250"/>
+            <w:tcW w:type="dxa" w:w="2000"/>
             <w:tcBorders>
               <w:top w:val="single" w:color="C9D2DE" w:sz="4"/>
               <w:left w:val="single" w:color="C9D2DE" w:sz="4"/>
@@ -8328,13 +8328,13 @@
                 <w:sz w:val="19"/>
                 <w:szCs w:val="19"/>
               </w:rPr>
-              <w:t xml:space="preserve">FR-TI-02</w:t>
-            </w:r>
-          </w:p>
-        </w:tc>
-        <w:tc>
-          <w:tcPr>
-            <w:tcW w:type="dxa" w:w="5050"/>
+              <w:t xml:space="preserve">Crew and review</w:t>
+            </w:r>
+          </w:p>
+        </w:tc>
+        <w:tc>
+          <w:tcPr>
+            <w:tcW w:type="dxa" w:w="4600"/>
             <w:tcBorders>
               <w:top w:val="single" w:color="C9D2DE" w:sz="4"/>
               <w:left w:val="single" w:color="C9D2DE" w:sz="4"/>
@@ -8367,7 +8367,7 @@
         </w:tc>
         <w:tc>
           <w:tcPr>
-            <w:tcW w:type="dxa" w:w="3600"/>
+            <w:tcW w:type="dxa" w:w="3300"/>
             <w:tcBorders>
               <w:top w:val="single" w:color="C9D2DE" w:sz="4"/>
               <w:left w:val="single" w:color="C9D2DE" w:sz="4"/>
@@ -8405,7 +8405,7 @@
         </w:trPr>
         <w:tc>
           <w:tcPr>
-            <w:tcW w:type="dxa" w:w="1250"/>
+            <w:tcW w:type="dxa" w:w="2000"/>
             <w:tcBorders>
               <w:top w:val="single" w:color="C9D2DE" w:sz="4"/>
               <w:left w:val="single" w:color="C9D2DE" w:sz="4"/>
@@ -8433,13 +8433,13 @@
                 <w:sz w:val="19"/>
                 <w:szCs w:val="19"/>
               </w:rPr>
-              <w:t xml:space="preserve">FR-TI-03</w:t>
-            </w:r>
-          </w:p>
-        </w:tc>
-        <w:tc>
-          <w:tcPr>
-            <w:tcW w:type="dxa" w:w="5050"/>
+              <w:t xml:space="preserve">Link or QR access</w:t>
+            </w:r>
+          </w:p>
+        </w:tc>
+        <w:tc>
+          <w:tcPr>
+            <w:tcW w:type="dxa" w:w="4600"/>
             <w:tcBorders>
               <w:top w:val="single" w:color="C9D2DE" w:sz="4"/>
               <w:left w:val="single" w:color="C9D2DE" w:sz="4"/>
@@ -8472,7 +8472,7 @@
         </w:tc>
         <w:tc>
           <w:tcPr>
-            <w:tcW w:type="dxa" w:w="3600"/>
+            <w:tcW w:type="dxa" w:w="3300"/>
             <w:tcBorders>
               <w:top w:val="single" w:color="C9D2DE" w:sz="4"/>
               <w:left w:val="single" w:color="C9D2DE" w:sz="4"/>
@@ -8510,7 +8510,7 @@
         </w:trPr>
         <w:tc>
           <w:tcPr>
-            <w:tcW w:type="dxa" w:w="1250"/>
+            <w:tcW w:type="dxa" w:w="2000"/>
             <w:tcBorders>
               <w:top w:val="single" w:color="C9D2DE" w:sz="4"/>
               <w:left w:val="single" w:color="C9D2DE" w:sz="4"/>
@@ -8538,13 +8538,13 @@
                 <w:sz w:val="19"/>
                 <w:szCs w:val="19"/>
               </w:rPr>
-              <w:t xml:space="preserve">FR-TI-04</w:t>
-            </w:r>
-          </w:p>
-        </w:tc>
-        <w:tc>
-          <w:tcPr>
-            <w:tcW w:type="dxa" w:w="5050"/>
+              <w:t xml:space="preserve">Closure record</w:t>
+            </w:r>
+          </w:p>
+        </w:tc>
+        <w:tc>
+          <w:tcPr>
+            <w:tcW w:type="dxa" w:w="4600"/>
             <w:tcBorders>
               <w:top w:val="single" w:color="C9D2DE" w:sz="4"/>
               <w:left w:val="single" w:color="C9D2DE" w:sz="4"/>
@@ -8577,7 +8577,7 @@
         </w:tc>
         <w:tc>
           <w:tcPr>
-            <w:tcW w:type="dxa" w:w="3600"/>
+            <w:tcW w:type="dxa" w:w="3300"/>
             <w:tcBorders>
               <w:top w:val="single" w:color="C9D2DE" w:sz="4"/>
               <w:left w:val="single" w:color="C9D2DE" w:sz="4"/>
@@ -8753,9 +8753,9 @@
         </w:tblBorders>
       </w:tblPr>
       <w:tblGrid>
-        <w:gridCol w:w="1250"/>
-        <w:gridCol w:w="5050"/>
-        <w:gridCol w:w="3600"/>
+        <w:gridCol w:w="2000"/>
+        <w:gridCol w:w="4600"/>
+        <w:gridCol w:w="3300"/>
       </w:tblGrid>
       <w:tr>
         <w:trPr>
@@ -8764,7 +8764,7 @@
         </w:trPr>
         <w:tc>
           <w:tcPr>
-            <w:tcW w:type="dxa" w:w="1250"/>
+            <w:tcW w:type="dxa" w:w="2000"/>
             <w:tcBorders>
               <w:top w:val="single" w:color="C9D2DE" w:sz="4"/>
               <w:left w:val="single" w:color="C9D2DE" w:sz="4"/>
@@ -8793,13 +8793,13 @@
                 <w:sz w:val="19"/>
                 <w:szCs w:val="19"/>
               </w:rPr>
-              <w:t xml:space="preserve">ID</w:t>
-            </w:r>
-          </w:p>
-        </w:tc>
-        <w:tc>
-          <w:tcPr>
-            <w:tcW w:type="dxa" w:w="5050"/>
+              <w:t xml:space="preserve">Requirement</w:t>
+            </w:r>
+          </w:p>
+        </w:tc>
+        <w:tc>
+          <w:tcPr>
+            <w:tcW w:type="dxa" w:w="4600"/>
             <w:tcBorders>
               <w:top w:val="single" w:color="C9D2DE" w:sz="4"/>
               <w:left w:val="single" w:color="C9D2DE" w:sz="4"/>
@@ -8834,7 +8834,7 @@
         </w:tc>
         <w:tc>
           <w:tcPr>
-            <w:tcW w:type="dxa" w:w="3600"/>
+            <w:tcW w:type="dxa" w:w="3300"/>
             <w:tcBorders>
               <w:top w:val="single" w:color="C9D2DE" w:sz="4"/>
               <w:left w:val="single" w:color="C9D2DE" w:sz="4"/>
@@ -8874,7 +8874,7 @@
         </w:trPr>
         <w:tc>
           <w:tcPr>
-            <w:tcW w:type="dxa" w:w="1250"/>
+            <w:tcW w:type="dxa" w:w="2000"/>
             <w:tcBorders>
               <w:top w:val="single" w:color="C9D2DE" w:sz="4"/>
               <w:left w:val="single" w:color="C9D2DE" w:sz="4"/>
@@ -8902,13 +8902,13 @@
                 <w:sz w:val="19"/>
                 <w:szCs w:val="19"/>
               </w:rPr>
-              <w:t xml:space="preserve">FR-BRD-01</w:t>
-            </w:r>
-          </w:p>
-        </w:tc>
-        <w:tc>
-          <w:tcPr>
-            <w:tcW w:type="dxa" w:w="5050"/>
+              <w:t xml:space="preserve">Worker record</w:t>
+            </w:r>
+          </w:p>
+        </w:tc>
+        <w:tc>
+          <w:tcPr>
+            <w:tcW w:type="dxa" w:w="4600"/>
             <w:tcBorders>
               <w:top w:val="single" w:color="C9D2DE" w:sz="4"/>
               <w:left w:val="single" w:color="C9D2DE" w:sz="4"/>
@@ -8941,7 +8941,7 @@
         </w:tc>
         <w:tc>
           <w:tcPr>
-            <w:tcW w:type="dxa" w:w="3600"/>
+            <w:tcW w:type="dxa" w:w="3300"/>
             <w:tcBorders>
               <w:top w:val="single" w:color="C9D2DE" w:sz="4"/>
               <w:left w:val="single" w:color="C9D2DE" w:sz="4"/>
@@ -8979,7 +8979,7 @@
         </w:trPr>
         <w:tc>
           <w:tcPr>
-            <w:tcW w:type="dxa" w:w="1250"/>
+            <w:tcW w:type="dxa" w:w="2000"/>
             <w:tcBorders>
               <w:top w:val="single" w:color="C9D2DE" w:sz="4"/>
               <w:left w:val="single" w:color="C9D2DE" w:sz="4"/>
@@ -9007,13 +9007,13 @@
                 <w:sz w:val="19"/>
                 <w:szCs w:val="19"/>
               </w:rPr>
-              <w:t xml:space="preserve">FR-BRD-02</w:t>
-            </w:r>
-          </w:p>
-        </w:tc>
-        <w:tc>
-          <w:tcPr>
-            <w:tcW w:type="dxa" w:w="5050"/>
+              <w:t xml:space="preserve">Document expiry</w:t>
+            </w:r>
+          </w:p>
+        </w:tc>
+        <w:tc>
+          <w:tcPr>
+            <w:tcW w:type="dxa" w:w="4600"/>
             <w:tcBorders>
               <w:top w:val="single" w:color="C9D2DE" w:sz="4"/>
               <w:left w:val="single" w:color="C9D2DE" w:sz="4"/>
@@ -9046,7 +9046,7 @@
         </w:tc>
         <w:tc>
           <w:tcPr>
-            <w:tcW w:type="dxa" w:w="3600"/>
+            <w:tcW w:type="dxa" w:w="3300"/>
             <w:tcBorders>
               <w:top w:val="single" w:color="C9D2DE" w:sz="4"/>
               <w:left w:val="single" w:color="C9D2DE" w:sz="4"/>
@@ -9084,7 +9084,7 @@
         </w:trPr>
         <w:tc>
           <w:tcPr>
-            <w:tcW w:type="dxa" w:w="1250"/>
+            <w:tcW w:type="dxa" w:w="2000"/>
             <w:tcBorders>
               <w:top w:val="single" w:color="C9D2DE" w:sz="4"/>
               <w:left w:val="single" w:color="C9D2DE" w:sz="4"/>
@@ -9112,13 +9112,13 @@
                 <w:sz w:val="19"/>
                 <w:szCs w:val="19"/>
               </w:rPr>
-              <w:t xml:space="preserve">FR-BRD-03</w:t>
-            </w:r>
-          </w:p>
-        </w:tc>
-        <w:tc>
-          <w:tcPr>
-            <w:tcW w:type="dxa" w:w="5050"/>
+              <w:t xml:space="preserve">Medical fitness</w:t>
+            </w:r>
+          </w:p>
+        </w:tc>
+        <w:tc>
+          <w:tcPr>
+            <w:tcW w:type="dxa" w:w="4600"/>
             <w:tcBorders>
               <w:top w:val="single" w:color="C9D2DE" w:sz="4"/>
               <w:left w:val="single" w:color="C9D2DE" w:sz="4"/>
@@ -9151,7 +9151,7 @@
         </w:tc>
         <w:tc>
           <w:tcPr>
-            <w:tcW w:type="dxa" w:w="3600"/>
+            <w:tcW w:type="dxa" w:w="3300"/>
             <w:tcBorders>
               <w:top w:val="single" w:color="C9D2DE" w:sz="4"/>
               <w:left w:val="single" w:color="C9D2DE" w:sz="4"/>
@@ -9189,7 +9189,7 @@
         </w:trPr>
         <w:tc>
           <w:tcPr>
-            <w:tcW w:type="dxa" w:w="1250"/>
+            <w:tcW w:type="dxa" w:w="2000"/>
             <w:tcBorders>
               <w:top w:val="single" w:color="C9D2DE" w:sz="4"/>
               <w:left w:val="single" w:color="C9D2DE" w:sz="4"/>
@@ -9217,13 +9217,13 @@
                 <w:sz w:val="19"/>
                 <w:szCs w:val="19"/>
               </w:rPr>
-              <w:t xml:space="preserve">FR-BRD-04</w:t>
-            </w:r>
-          </w:p>
-        </w:tc>
-        <w:tc>
-          <w:tcPr>
-            <w:tcW w:type="dxa" w:w="5050"/>
+              <w:t xml:space="preserve">Training record</w:t>
+            </w:r>
+          </w:p>
+        </w:tc>
+        <w:tc>
+          <w:tcPr>
+            <w:tcW w:type="dxa" w:w="4600"/>
             <w:tcBorders>
               <w:top w:val="single" w:color="C9D2DE" w:sz="4"/>
               <w:left w:val="single" w:color="C9D2DE" w:sz="4"/>
@@ -9256,7 +9256,7 @@
         </w:tc>
         <w:tc>
           <w:tcPr>
-            <w:tcW w:type="dxa" w:w="3600"/>
+            <w:tcW w:type="dxa" w:w="3300"/>
             <w:tcBorders>
               <w:top w:val="single" w:color="C9D2DE" w:sz="4"/>
               <w:left w:val="single" w:color="C9D2DE" w:sz="4"/>
@@ -9294,7 +9294,7 @@
         </w:trPr>
         <w:tc>
           <w:tcPr>
-            <w:tcW w:type="dxa" w:w="1250"/>
+            <w:tcW w:type="dxa" w:w="2000"/>
             <w:tcBorders>
               <w:top w:val="single" w:color="C9D2DE" w:sz="4"/>
               <w:left w:val="single" w:color="C9D2DE" w:sz="4"/>
@@ -9322,13 +9322,13 @@
                 <w:sz w:val="19"/>
                 <w:szCs w:val="19"/>
               </w:rPr>
-              <w:t xml:space="preserve">FR-BRD-05</w:t>
-            </w:r>
-          </w:p>
-        </w:tc>
-        <w:tc>
-          <w:tcPr>
-            <w:tcW w:type="dxa" w:w="5050"/>
+              <w:t xml:space="preserve">Pass and gate log</w:t>
+            </w:r>
+          </w:p>
+        </w:tc>
+        <w:tc>
+          <w:tcPr>
+            <w:tcW w:type="dxa" w:w="4600"/>
             <w:tcBorders>
               <w:top w:val="single" w:color="C9D2DE" w:sz="4"/>
               <w:left w:val="single" w:color="C9D2DE" w:sz="4"/>
@@ -9361,7 +9361,7 @@
         </w:tc>
         <w:tc>
           <w:tcPr>
-            <w:tcW w:type="dxa" w:w="3600"/>
+            <w:tcW w:type="dxa" w:w="3300"/>
             <w:tcBorders>
               <w:top w:val="single" w:color="C9D2DE" w:sz="4"/>
               <w:left w:val="single" w:color="C9D2DE" w:sz="4"/>
@@ -9399,7 +9399,7 @@
         </w:trPr>
         <w:tc>
           <w:tcPr>
-            <w:tcW w:type="dxa" w:w="1250"/>
+            <w:tcW w:type="dxa" w:w="2000"/>
             <w:tcBorders>
               <w:top w:val="single" w:color="C9D2DE" w:sz="4"/>
               <w:left w:val="single" w:color="C9D2DE" w:sz="4"/>
@@ -9427,13 +9427,13 @@
                 <w:sz w:val="19"/>
                 <w:szCs w:val="19"/>
               </w:rPr>
-              <w:t xml:space="preserve">FR-BRD-06</w:t>
-            </w:r>
-          </w:p>
-        </w:tc>
-        <w:tc>
-          <w:tcPr>
-            <w:tcW w:type="dxa" w:w="5050"/>
+              <w:t xml:space="preserve">Transfers and offboarding</w:t>
+            </w:r>
+          </w:p>
+        </w:tc>
+        <w:tc>
+          <w:tcPr>
+            <w:tcW w:type="dxa" w:w="4600"/>
             <w:tcBorders>
               <w:top w:val="single" w:color="C9D2DE" w:sz="4"/>
               <w:left w:val="single" w:color="C9D2DE" w:sz="4"/>
@@ -9466,7 +9466,7 @@
         </w:tc>
         <w:tc>
           <w:tcPr>
-            <w:tcW w:type="dxa" w:w="3600"/>
+            <w:tcW w:type="dxa" w:w="3300"/>
             <w:tcBorders>
               <w:top w:val="single" w:color="C9D2DE" w:sz="4"/>
               <w:left w:val="single" w:color="C9D2DE" w:sz="4"/>
@@ -9642,9 +9642,9 @@
         </w:tblBorders>
       </w:tblPr>
       <w:tblGrid>
-        <w:gridCol w:w="1250"/>
-        <w:gridCol w:w="5050"/>
-        <w:gridCol w:w="3600"/>
+        <w:gridCol w:w="2000"/>
+        <w:gridCol w:w="4600"/>
+        <w:gridCol w:w="3300"/>
       </w:tblGrid>
       <w:tr>
         <w:trPr>
@@ -9653,7 +9653,7 @@
         </w:trPr>
         <w:tc>
           <w:tcPr>
-            <w:tcW w:type="dxa" w:w="1250"/>
+            <w:tcW w:type="dxa" w:w="2000"/>
             <w:tcBorders>
               <w:top w:val="single" w:color="C9D2DE" w:sz="4"/>
               <w:left w:val="single" w:color="C9D2DE" w:sz="4"/>
@@ -9682,13 +9682,13 @@
                 <w:sz w:val="19"/>
                 <w:szCs w:val="19"/>
               </w:rPr>
-              <w:t xml:space="preserve">ID</w:t>
-            </w:r>
-          </w:p>
-        </w:tc>
-        <w:tc>
-          <w:tcPr>
-            <w:tcW w:type="dxa" w:w="5050"/>
+              <w:t xml:space="preserve">Requirement</w:t>
+            </w:r>
+          </w:p>
+        </w:tc>
+        <w:tc>
+          <w:tcPr>
+            <w:tcW w:type="dxa" w:w="4600"/>
             <w:tcBorders>
               <w:top w:val="single" w:color="C9D2DE" w:sz="4"/>
               <w:left w:val="single" w:color="C9D2DE" w:sz="4"/>
@@ -9723,7 +9723,7 @@
         </w:tc>
         <w:tc>
           <w:tcPr>
-            <w:tcW w:type="dxa" w:w="3600"/>
+            <w:tcW w:type="dxa" w:w="3300"/>
             <w:tcBorders>
               <w:top w:val="single" w:color="C9D2DE" w:sz="4"/>
               <w:left w:val="single" w:color="C9D2DE" w:sz="4"/>
@@ -9763,7 +9763,7 @@
         </w:trPr>
         <w:tc>
           <w:tcPr>
-            <w:tcW w:type="dxa" w:w="1250"/>
+            <w:tcW w:type="dxa" w:w="2000"/>
             <w:tcBorders>
               <w:top w:val="single" w:color="C9D2DE" w:sz="4"/>
               <w:left w:val="single" w:color="C9D2DE" w:sz="4"/>
@@ -9791,13 +9791,13 @@
                 <w:sz w:val="19"/>
                 <w:szCs w:val="19"/>
               </w:rPr>
-              <w:t xml:space="preserve">FR-EQP-01</w:t>
-            </w:r>
-          </w:p>
-        </w:tc>
-        <w:tc>
-          <w:tcPr>
-            <w:tcW w:type="dxa" w:w="5050"/>
+              <w:t xml:space="preserve">Asset register</w:t>
+            </w:r>
+          </w:p>
+        </w:tc>
+        <w:tc>
+          <w:tcPr>
+            <w:tcW w:type="dxa" w:w="4600"/>
             <w:tcBorders>
               <w:top w:val="single" w:color="C9D2DE" w:sz="4"/>
               <w:left w:val="single" w:color="C9D2DE" w:sz="4"/>
@@ -9830,7 +9830,7 @@
         </w:tc>
         <w:tc>
           <w:tcPr>
-            <w:tcW w:type="dxa" w:w="3600"/>
+            <w:tcW w:type="dxa" w:w="3300"/>
             <w:tcBorders>
               <w:top w:val="single" w:color="C9D2DE" w:sz="4"/>
               <w:left w:val="single" w:color="C9D2DE" w:sz="4"/>
@@ -9868,7 +9868,7 @@
         </w:trPr>
         <w:tc>
           <w:tcPr>
-            <w:tcW w:type="dxa" w:w="1250"/>
+            <w:tcW w:type="dxa" w:w="2000"/>
             <w:tcBorders>
               <w:top w:val="single" w:color="C9D2DE" w:sz="4"/>
               <w:left w:val="single" w:color="C9D2DE" w:sz="4"/>
@@ -9896,13 +9896,13 @@
                 <w:sz w:val="19"/>
                 <w:szCs w:val="19"/>
               </w:rPr>
-              <w:t xml:space="preserve">FR-EQP-02</w:t>
-            </w:r>
-          </w:p>
-        </w:tc>
-        <w:tc>
-          <w:tcPr>
-            <w:tcW w:type="dxa" w:w="5050"/>
+              <w:t xml:space="preserve">Document verification</w:t>
+            </w:r>
+          </w:p>
+        </w:tc>
+        <w:tc>
+          <w:tcPr>
+            <w:tcW w:type="dxa" w:w="4600"/>
             <w:tcBorders>
               <w:top w:val="single" w:color="C9D2DE" w:sz="4"/>
               <w:left w:val="single" w:color="C9D2DE" w:sz="4"/>
@@ -9935,7 +9935,7 @@
         </w:tc>
         <w:tc>
           <w:tcPr>
-            <w:tcW w:type="dxa" w:w="3600"/>
+            <w:tcW w:type="dxa" w:w="3300"/>
             <w:tcBorders>
               <w:top w:val="single" w:color="C9D2DE" w:sz="4"/>
               <w:left w:val="single" w:color="C9D2DE" w:sz="4"/>
@@ -9973,7 +9973,7 @@
         </w:trPr>
         <w:tc>
           <w:tcPr>
-            <w:tcW w:type="dxa" w:w="1250"/>
+            <w:tcW w:type="dxa" w:w="2000"/>
             <w:tcBorders>
               <w:top w:val="single" w:color="C9D2DE" w:sz="4"/>
               <w:left w:val="single" w:color="C9D2DE" w:sz="4"/>
@@ -10001,13 +10001,13 @@
                 <w:sz w:val="19"/>
                 <w:szCs w:val="19"/>
               </w:rPr>
-              <w:t xml:space="preserve">FR-EQP-03</w:t>
-            </w:r>
-          </w:p>
-        </w:tc>
-        <w:tc>
-          <w:tcPr>
-            <w:tcW w:type="dxa" w:w="5050"/>
+              <w:t xml:space="preserve">Mobilization control</w:t>
+            </w:r>
+          </w:p>
+        </w:tc>
+        <w:tc>
+          <w:tcPr>
+            <w:tcW w:type="dxa" w:w="4600"/>
             <w:tcBorders>
               <w:top w:val="single" w:color="C9D2DE" w:sz="4"/>
               <w:left w:val="single" w:color="C9D2DE" w:sz="4"/>
@@ -10040,7 +10040,7 @@
         </w:tc>
         <w:tc>
           <w:tcPr>
-            <w:tcW w:type="dxa" w:w="3600"/>
+            <w:tcW w:type="dxa" w:w="3300"/>
             <w:tcBorders>
               <w:top w:val="single" w:color="C9D2DE" w:sz="4"/>
               <w:left w:val="single" w:color="C9D2DE" w:sz="4"/>
@@ -10078,7 +10078,7 @@
         </w:trPr>
         <w:tc>
           <w:tcPr>
-            <w:tcW w:type="dxa" w:w="1250"/>
+            <w:tcW w:type="dxa" w:w="2000"/>
             <w:tcBorders>
               <w:top w:val="single" w:color="C9D2DE" w:sz="4"/>
               <w:left w:val="single" w:color="C9D2DE" w:sz="4"/>
@@ -10106,13 +10106,13 @@
                 <w:sz w:val="19"/>
                 <w:szCs w:val="19"/>
               </w:rPr>
-              <w:t xml:space="preserve">FR-EQP-04</w:t>
-            </w:r>
-          </w:p>
-        </w:tc>
-        <w:tc>
-          <w:tcPr>
-            <w:tcW w:type="dxa" w:w="5050"/>
+              <w:t xml:space="preserve">Inspections and maintenance</w:t>
+            </w:r>
+          </w:p>
+        </w:tc>
+        <w:tc>
+          <w:tcPr>
+            <w:tcW w:type="dxa" w:w="4600"/>
             <w:tcBorders>
               <w:top w:val="single" w:color="C9D2DE" w:sz="4"/>
               <w:left w:val="single" w:color="C9D2DE" w:sz="4"/>
@@ -10145,7 +10145,7 @@
         </w:tc>
         <w:tc>
           <w:tcPr>
-            <w:tcW w:type="dxa" w:w="3600"/>
+            <w:tcW w:type="dxa" w:w="3300"/>
             <w:tcBorders>
               <w:top w:val="single" w:color="C9D2DE" w:sz="4"/>
               <w:left w:val="single" w:color="C9D2DE" w:sz="4"/>
@@ -10183,7 +10183,7 @@
         </w:trPr>
         <w:tc>
           <w:tcPr>
-            <w:tcW w:type="dxa" w:w="1250"/>
+            <w:tcW w:type="dxa" w:w="2000"/>
             <w:tcBorders>
               <w:top w:val="single" w:color="C9D2DE" w:sz="4"/>
               <w:left w:val="single" w:color="C9D2DE" w:sz="4"/>
@@ -10211,13 +10211,13 @@
                 <w:sz w:val="19"/>
                 <w:szCs w:val="19"/>
               </w:rPr>
-              <w:t xml:space="preserve">FR-EQP-05</w:t>
-            </w:r>
-          </w:p>
-        </w:tc>
-        <w:tc>
-          <w:tcPr>
-            <w:tcW w:type="dxa" w:w="5050"/>
+              <w:t xml:space="preserve">Demobilization and import</w:t>
+            </w:r>
+          </w:p>
+        </w:tc>
+        <w:tc>
+          <w:tcPr>
+            <w:tcW w:type="dxa" w:w="4600"/>
             <w:tcBorders>
               <w:top w:val="single" w:color="C9D2DE" w:sz="4"/>
               <w:left w:val="single" w:color="C9D2DE" w:sz="4"/>
@@ -10250,7 +10250,7 @@
         </w:tc>
         <w:tc>
           <w:tcPr>
-            <w:tcW w:type="dxa" w:w="3600"/>
+            <w:tcW w:type="dxa" w:w="3300"/>
             <w:tcBorders>
               <w:top w:val="single" w:color="C9D2DE" w:sz="4"/>
               <w:left w:val="single" w:color="C9D2DE" w:sz="4"/>
@@ -10288,7 +10288,7 @@
         </w:trPr>
         <w:tc>
           <w:tcPr>
-            <w:tcW w:type="dxa" w:w="1250"/>
+            <w:tcW w:type="dxa" w:w="2000"/>
             <w:tcBorders>
               <w:top w:val="single" w:color="C9D2DE" w:sz="4"/>
               <w:left w:val="single" w:color="C9D2DE" w:sz="4"/>
@@ -10316,13 +10316,13 @@
                 <w:sz w:val="19"/>
                 <w:szCs w:val="19"/>
               </w:rPr>
-              <w:t xml:space="preserve">FR-EQP-06</w:t>
-            </w:r>
-          </w:p>
-        </w:tc>
-        <w:tc>
-          <w:tcPr>
-            <w:tcW w:type="dxa" w:w="5050"/>
+              <w:t xml:space="preserve">Dashboard and reports</w:t>
+            </w:r>
+          </w:p>
+        </w:tc>
+        <w:tc>
+          <w:tcPr>
+            <w:tcW w:type="dxa" w:w="4600"/>
             <w:tcBorders>
               <w:top w:val="single" w:color="C9D2DE" w:sz="4"/>
               <w:left w:val="single" w:color="C9D2DE" w:sz="4"/>
@@ -10355,7 +10355,7 @@
         </w:tc>
         <w:tc>
           <w:tcPr>
-            <w:tcW w:type="dxa" w:w="3600"/>
+            <w:tcW w:type="dxa" w:w="3300"/>
             <w:tcBorders>
               <w:top w:val="single" w:color="C9D2DE" w:sz="4"/>
               <w:left w:val="single" w:color="C9D2DE" w:sz="4"/>

</xml_diff>